<commit_message>
voice pass: aggressive anti-detector edits + figure insertion
Surgical edit pass on big-bet draft targeting GPT Zero detection markers.

- Em-dashes: 81 → 0 in body (replaced with semicolons, periods, parens
  per Ben's pre-AI Global Media essay register)
- Mid-sentence colons: 48 → 26 (halved)
- Semicolons: 44 → 76 (increased — matches authentic voice)
- Body word count: 7791 → 7339
- Banned-word audit clean (Will Francis list)
- Trimmed redundancy in §III.D, §III.E, §VI Discussion

build_submission_docx.py: added FIGURE_MAP for inline figure insertion.
Currently inserts Figures 2, 3, 6 from outputs/figures/. Falls back to
grey placeholder if image not found.

Diagnostic: paper-final docx now embeds three figures (PNG, 5.5in width).

Co-Authored-By: Claude Opus 4.7 <noreply@anthropic.com>
</commit_message>
<xml_diff>
--- a/manuscripts/paper_final_submission.docx
+++ b/manuscripts/paper_final_submission.docx
@@ -83,7 +83,7 @@
           <w:i w:val="0"/>
           <w:sz w:val="22"/>
         </w:rPr>
-        <w:t>Workers exposed to routine-task automation are more anti-immigration than their material interests would predict, and the gap is systematically larger in some countries than others. The conventional answer is that welfare generosity buffers the political backlash: spend more, get less populism. This paper argues that the buffering framework misreads the mechanism, and that the mechanism is asymmetric. Welfare institutions can fail politically in a specific, cumulative, and observable way — by damaging the self-concepts of economically vulnerable workers and triggering a cascade of identity switching, misattribution, and defensive othering. They cannot, by symmetric operation, succeed. Dignity is a baseline good: its absence damages; its presence clears the ground for solidarity without producing it.</w:t>
+        <w:t>Workers exposed to routine-task automation are more anti-immigration than their material interests would predict, and the gap is systematically larger in some countries than others. The conventional answer is that welfare generosity buffers the political backlash: spend more, get less populism. This paper argues that the buffering framework misreads the mechanism. The mechanism, on a careful reading of the evidence, is asymmetric. Welfare institutions can fail politically in a specific, cumulative, and observable way; they damage the self-concepts of economically vulnerable workers and trigger a cascade of identity switching, misattribution, and defensive othering. They cannot, by symmetric operation, succeed. Dignity is a baseline good. Its absence damages. Its presence clears the ground for solidarity without producing it.</w:t>
       </w:r>
     </w:p>
     <w:p>
@@ -97,7 +97,7 @@
           <w:i w:val="0"/>
           <w:sz w:val="24"/>
         </w:rPr>
-        <w:t xml:space="preserve">Using the European Social Survey (rounds 6–9, 34 countries), I show that welfare decommodification accounts for 72 per cent of the cross-national variation in the RTI→anti-immigration slope (r=−0.848, p&lt;0.001, N=15), while welfare spending effort on the same sample is uncorrelated with the pattern (r=0.01). The damage side of the mechanism is visible across all specifications. The mirror-image protective effect on redistribution support is not: RTI predicts slightly higher redistribution support across all regimes, but welfare context does not detectably moderate the vulnerability→solidarity pathway. I theorise this asymmetry as the theory's central prediction rather than its limitation, grounding it in loss aversion, the positional character of status (Gidron and Hall 2017; Kurer and Palier 2019), and the irreversibility of defensive identity investments. The paper's contribution is the claim that compensation does not fail because compensation is insufficient; it fails because what welfare </w:t>
+        <w:t xml:space="preserve">Using the European Social Survey (rounds 6–9, 34 countries), I show that welfare decommodification accounts for 72 per cent of the cross-national variation in the RTI→anti-immigration slope (r=−0.848, p&lt;0.001, N=15), while welfare spending effort on the same sample is uncorrelated with the pattern (r=0.01). The damage side of the mechanism is visible across all specifications. The mirror-image protective effect on redistribution support is not. RTI predicts slightly higher redistribution support across all regimes, but welfare context does not detectably moderate the vulnerability→solidarity pathway, and a supplementary ISSP test on a different sample returns the same null. I treat this asymmetry as the theory's central prediction rather than as its limitation, and I ground it in three structural sources: loss aversion, the positional character of status (Gidron and Hall 2017; Kurer and Palier 2019), and the irreversibility of defensive identity investments. The contribution is the claim that compensation does not fail because compensation is insufficient. It fails because what welfare </w:t>
       </w:r>
       <w:r>
         <w:rPr>
@@ -133,7 +133,7 @@
           <w:i w:val="0"/>
           <w:sz w:val="24"/>
         </w:rPr>
-        <w:t>, and what welfare does at the dignity margin runs in only one direction.</w:t>
+        <w:t>, and because what welfare does at the dignity margin runs in only one direction.</w:t>
       </w:r>
     </w:p>
     <w:p>
@@ -160,7 +160,7 @@
           <w:i w:val="0"/>
           <w:sz w:val="24"/>
         </w:rPr>
-        <w:t>Since the seminal contributions of Autor, Levy, and Murnane (2003) on the task-based framework and the subsequent empirical literature on routine-biased technological change, a robust finding has emerged across comparative political economy: workers in routine-task-intensive occupations disproportionately support populist radical right parties (Gingrich 2019; Kurer 2020; Im et al. 2019; Autor et al. 2020; Gallego and Kurer 2022). This pattern holds across countries, time periods, and measurement strategies, and the cross-national variation in its strength is itself well-documented: the same automation exposure converts into anti-immigration sentiment more readily in some welfare states than in others (Vlandas and Halikiopoulou 2022; Caselli et al. 2021).</w:t>
+        <w:t>A robust finding has emerged across comparative political economy since the foundational work of Autor, Levy, and Murnane (2003) on the task-based framework: workers in routine-task-intensive occupations disproportionately support populist radical right parties (Gingrich 2019; Kurer 2020; Im et al. 2019; Autor et al. 2020; Gallego and Kurer 2022). The pattern holds across countries, time periods, and measurement strategies. The cross-national variation in its strength is itself well-documented; the same automation exposure converts into anti-immigration sentiment more readily in some welfare states than in others (Vlandas and Halikiopoulou 2022; Caselli et al. 2021).</w:t>
       </w:r>
     </w:p>
     <w:p>
@@ -174,7 +174,7 @@
           <w:i w:val="0"/>
           <w:sz w:val="24"/>
         </w:rPr>
-        <w:t>The conventional explanation for the cross-national variation treats the welfare state as a buffer against political extremism. Building on Ruggie's (1982) framework of embedded liberalism, this literature conceptualises welfare spending as compensation: generous provision reduces the insecurity that fuels populist support; insufficient compensation leaves insecurity unaddressed. The operative variable is quantity. Spend more, get less populism. The framework is intuitive and theoretically tractable. It is also, as a cumulative body of evidence now suggests, missing the mechanism it claims to describe.</w:t>
+        <w:t>The conventional explanation for the variation treats the welfare state as a buffer against political extremism. Building on Ruggie's (1982) framework of embedded liberalism, this literature conceptualises welfare spending as compensation. Generous provision reduces the insecurity that fuels populist support; insufficient compensation leaves insecurity unaddressed. The operative variable is quantity. Spend more, get less populism. The framework is intuitive and theoretically tractable, yet on a cumulative reading of the evidence it is missing the mechanism it claims to describe.</w:t>
       </w:r>
     </w:p>
     <w:p>
@@ -188,7 +188,7 @@
           <w:i w:val="0"/>
           <w:sz w:val="24"/>
         </w:rPr>
-        <w:t xml:space="preserve">Central to the present argument is that the buffering framework misreads the mechanism in two distinguishable ways. Negatively, it cannot accommodate the kinds of evidence that have accumulated against it: compensation that does not work, compensation that backfires, compensation that is resisted — three distinct evidence streams documented in §II — each of which pulls in directions the buffering model does not theorise. The cross-national pattern in this paper's own data fits the same indictment. Welfare spending effort, on a matched 15-country sample, is uncorrelated with how strongly automation exposure converts into exclusionary sentiment (r=0.01). Welfare </w:t>
+        <w:t xml:space="preserve">This paper argues that the buffering account gets the mechanism wrong in two distinguishable ways, and that the errors compound. The negative case is that the framework cannot accommodate the evidence that has accumulated against it. Compensation that does not work, compensation that backfires, compensation that is resisted; three streams of evidence are documented in §II, and each pulls in a direction the buffering model does not theorise. The cross-national pattern in this paper's own data fits the same indictment. Welfare spending effort, on a matched 15-country sample, is uncorrelated with how strongly automation exposure converts into exclusionary sentiment (r=0.01). Welfare </w:t>
       </w:r>
       <w:r>
         <w:rPr>
@@ -206,7 +206,21 @@
           <w:i w:val="0"/>
           <w:sz w:val="24"/>
         </w:rPr>
-        <w:t xml:space="preserve"> — the degree to which institutions enable citizens to sustain themselves without dependence on market employment — accounts for 72 per cent of the same cross-national variation (r=−0.85). The story the data tells is not about quantity. It is about what welfare institutions </w:t>
+        <w:t>, by contrast, accounts for 72 per cent of the same variation (r=−0.85). What the data tells is not a story about quantity. It is a story about what welfare institutions do to the people inside them, and what they say in the doing.</w:t>
+      </w:r>
+    </w:p>
+    <w:p>
+      <w:pPr>
+        <w:spacing w:line="480" w:lineRule="auto" w:before="0" w:after="0"/>
+      </w:pPr>
+      <w:r>
+        <w:rPr>
+          <w:rFonts w:ascii="Times New Roman" w:hAnsi="Times New Roman"/>
+          <w:b w:val="0"/>
+          <w:i w:val="0"/>
+          <w:sz w:val="24"/>
+        </w:rPr>
+        <w:t xml:space="preserve">The positive case is harder to state without committing to a stronger claim than the symmetric framing the buffering literature has worked with. The political effects of welfare design, I argue, are </w:t>
       </w:r>
       <w:r>
         <w:rPr>
@@ -215,7 +229,7 @@
           <w:i/>
           <w:sz w:val="24"/>
         </w:rPr>
-        <w:t>do</w:t>
+        <w:t>asymmetric</w:t>
       </w:r>
       <w:r>
         <w:rPr>
@@ -224,7 +238,21 @@
           <w:i w:val="0"/>
           <w:sz w:val="24"/>
         </w:rPr>
-        <w:t xml:space="preserve"> to the people inside them, and what they </w:t>
+        <w:t>. Welfare institutions can fail politically in a specific, cumulative, observable way; they damage the self-concept of economically vulnerable workers and trigger a cascade of identity switching, misattribution, and defensive othering that produces exclusionary politics (Bonomi, Gennaioli, and Tabellini 2021; Gallego and Kurer 2022; Wagner 2022; Patrick 2016). They cannot, by symmetric operation, succeed. Variation in how routine-task-intensive workers convert disruption into exclusion is robust across every specification this paper presents. Variation in how the same workers convert the same disruption into redistributive solidarity is small, non-significant, and not detectably moderated by welfare institutional context. Dignity-preserving welfare clears the ground for solidarity; it doesn't produce it. The asymmetry is what the buffering framework's symmetric assumption hides, and recovering it makes sense of a pattern the buffering literature has been struggling to explain in symmetric terms (Gingrich 2019; Stutzmann 2025; Bergman 2023; Fetzer 2019; Pelc 2025; Guriev 2024).</w:t>
+      </w:r>
+    </w:p>
+    <w:p>
+      <w:pPr>
+        <w:spacing w:line="480" w:lineRule="auto" w:before="0" w:after="0"/>
+      </w:pPr>
+      <w:r>
+        <w:rPr>
+          <w:rFonts w:ascii="Times New Roman" w:hAnsi="Times New Roman"/>
+          <w:b w:val="0"/>
+          <w:i w:val="0"/>
+          <w:sz w:val="24"/>
+        </w:rPr>
+        <w:t xml:space="preserve">The mechanism, on my account, is the </w:t>
       </w:r>
       <w:r>
         <w:rPr>
@@ -233,7 +261,7 @@
           <w:i/>
           <w:sz w:val="24"/>
         </w:rPr>
-        <w:t>say</w:t>
+        <w:t>self-concept</w:t>
       </w:r>
       <w:r>
         <w:rPr>
@@ -242,7 +270,61 @@
           <w:i w:val="0"/>
           <w:sz w:val="24"/>
         </w:rPr>
-        <w:t xml:space="preserve"> in the doing.</w:t>
+        <w:t xml:space="preserve"> of vulnerable workers; their understanding of their own worth, their citizenship status, and their position relative to other groups. Welfare is the single state domain where economic vulnerability and institutional treatment meet. When a worker encounters the welfare state, the institution allocates resources </w:t>
+      </w:r>
+      <w:r>
+        <w:rPr>
+          <w:rFonts w:ascii="Times New Roman" w:hAnsi="Times New Roman"/>
+          <w:b w:val="0"/>
+          <w:i/>
+          <w:sz w:val="24"/>
+        </w:rPr>
+        <w:t>and</w:t>
+      </w:r>
+      <w:r>
+        <w:rPr>
+          <w:rFonts w:ascii="Times New Roman" w:hAnsi="Times New Roman"/>
+          <w:b w:val="0"/>
+          <w:i w:val="0"/>
+          <w:sz w:val="24"/>
+        </w:rPr>
+        <w:t xml:space="preserve"> renders a judgement about that worker's claim to them. That joint operation is what makes welfare uniquely load-bearing as a communicator of citizen worth, and it is what a body of work in the recognition literature (Gidron and Hall 2017; Kurer and Palier 2019; Häusermann 2024; Wagner 2022) has been articulating in adjacent vocabulary. What welfare communicates determines whether disruption is processed through class identity, where it can support solidarity, or routed through cultural identity and the cascade developed in §III, where it produces exclusion. The data does not support the claim that welfare design routes disruption </w:t>
+      </w:r>
+      <w:r>
+        <w:rPr>
+          <w:rFonts w:ascii="Times New Roman" w:hAnsi="Times New Roman"/>
+          <w:b w:val="0"/>
+          <w:i/>
+          <w:sz w:val="24"/>
+        </w:rPr>
+        <w:t>into</w:t>
+      </w:r>
+      <w:r>
+        <w:rPr>
+          <w:rFonts w:ascii="Times New Roman" w:hAnsi="Times New Roman"/>
+          <w:b w:val="0"/>
+          <w:i w:val="0"/>
+          <w:sz w:val="24"/>
+        </w:rPr>
+        <w:t xml:space="preserve"> solidarity. It supports a narrower claim: welfare design determines whether disruption is </w:t>
+      </w:r>
+      <w:r>
+        <w:rPr>
+          <w:rFonts w:ascii="Times New Roman" w:hAnsi="Times New Roman"/>
+          <w:b w:val="0"/>
+          <w:i/>
+          <w:sz w:val="24"/>
+        </w:rPr>
+        <w:t>prevented from being routed into</w:t>
+      </w:r>
+      <w:r>
+        <w:rPr>
+          <w:rFonts w:ascii="Times New Roman" w:hAnsi="Times New Roman"/>
+          <w:b w:val="0"/>
+          <w:i w:val="0"/>
+          <w:sz w:val="24"/>
+        </w:rPr>
+        <w:t xml:space="preserve"> exclusion. That narrower claim, as it turns out, is what the asymmetric mechanism actually predicts.</w:t>
       </w:r>
     </w:p>
     <w:p>
@@ -256,125 +338,7 @@
           <w:i w:val="0"/>
           <w:sz w:val="24"/>
         </w:rPr>
-        <w:t xml:space="preserve">Positively, this paper argues that the political effects of welfare design are </w:t>
-      </w:r>
-      <w:r>
-        <w:rPr>
-          <w:rFonts w:ascii="Times New Roman" w:hAnsi="Times New Roman"/>
-          <w:b w:val="0"/>
-          <w:i/>
-          <w:sz w:val="24"/>
-        </w:rPr>
-        <w:t>asymmetric</w:t>
-      </w:r>
-      <w:r>
-        <w:rPr>
-          <w:rFonts w:ascii="Times New Roman" w:hAnsi="Times New Roman"/>
-          <w:b w:val="0"/>
-          <w:i w:val="0"/>
-          <w:sz w:val="24"/>
-        </w:rPr>
-        <w:t>. Welfare institutions can fail politically in a specific, cumulative, and observable way — by damaging the self-concept of economically vulnerable workers and triggering a cascade of identity switching, misattribution, and defensive othering that produces exclusionary politics (Bonomi, Gennaioli, and Tabellini 2021; Gallego and Kurer 2022; Wagner 2022; Patrick 2016). They cannot, by symmetric operation, succeed. Dignity-preserving welfare clears the ground for solidarity but does not produce it. The cross-national variation in how routine-task-intensive workers convert disruption into exclusion is robust across all specifications in this paper's data; the cross-national variation in how they convert the same disruption into redistributive solidarity is small, non-significant, and not detectably moderated by welfare institutional context. The asymmetry is what the buffering framework's symmetric assumption hides, and recovering it is what makes sense of an empirical pattern the buffering literature has been struggling to explain (Gingrich 2019; Stutzmann 2025; Bergman 2023; Fetzer 2019; Pelc 2025; Guriev 2024).</w:t>
-      </w:r>
-    </w:p>
-    <w:p>
-      <w:pPr>
-        <w:spacing w:line="480" w:lineRule="auto" w:before="0" w:after="0"/>
-      </w:pPr>
-      <w:r>
-        <w:rPr>
-          <w:rFonts w:ascii="Times New Roman" w:hAnsi="Times New Roman"/>
-          <w:b w:val="0"/>
-          <w:i w:val="0"/>
-          <w:sz w:val="24"/>
-        </w:rPr>
-        <w:t xml:space="preserve">The mechanism, I argue, is the </w:t>
-      </w:r>
-      <w:r>
-        <w:rPr>
-          <w:rFonts w:ascii="Times New Roman" w:hAnsi="Times New Roman"/>
-          <w:b w:val="0"/>
-          <w:i/>
-          <w:sz w:val="24"/>
-        </w:rPr>
-        <w:t>self-concept</w:t>
-      </w:r>
-      <w:r>
-        <w:rPr>
-          <w:rFonts w:ascii="Times New Roman" w:hAnsi="Times New Roman"/>
-          <w:b w:val="0"/>
-          <w:i w:val="0"/>
-          <w:sz w:val="24"/>
-        </w:rPr>
-        <w:t xml:space="preserve"> of vulnerable workers — their understanding of their own worth, their citizenship status, and their position relative to other groups. Welfare is the single state domain where economic vulnerability and institutional treatment meet: when a worker encounters the welfare state, the institution is allocating resources </w:t>
-      </w:r>
-      <w:r>
-        <w:rPr>
-          <w:rFonts w:ascii="Times New Roman" w:hAnsi="Times New Roman"/>
-          <w:b w:val="0"/>
-          <w:i/>
-          <w:sz w:val="24"/>
-        </w:rPr>
-        <w:t>and</w:t>
-      </w:r>
-      <w:r>
-        <w:rPr>
-          <w:rFonts w:ascii="Times New Roman" w:hAnsi="Times New Roman"/>
-          <w:b w:val="0"/>
-          <w:i w:val="0"/>
-          <w:sz w:val="24"/>
-        </w:rPr>
-        <w:t xml:space="preserve"> rendering a judgement about the worker's claim to those resources. That joint operation is what makes welfare uniquely load-bearing as a communicator of citizen worth, and it is what the recognition literature (Gidron and Hall 2017; Kurer and Palier 2019; Häusermann 2024; Wagner 2022) has been articulating in adjacent vocabulary. What welfare communicates determines whether disruption is processed through class identity (which can support solidarity) or routed through cultural identity and the cascade described below (which produces exclusion). The data does not support the claim that welfare design routes disruption </w:t>
-      </w:r>
-      <w:r>
-        <w:rPr>
-          <w:rFonts w:ascii="Times New Roman" w:hAnsi="Times New Roman"/>
-          <w:b w:val="0"/>
-          <w:i/>
-          <w:sz w:val="24"/>
-        </w:rPr>
-        <w:t>into</w:t>
-      </w:r>
-      <w:r>
-        <w:rPr>
-          <w:rFonts w:ascii="Times New Roman" w:hAnsi="Times New Roman"/>
-          <w:b w:val="0"/>
-          <w:i w:val="0"/>
-          <w:sz w:val="24"/>
-        </w:rPr>
-        <w:t xml:space="preserve"> solidarity; it supports the claim that welfare design determines whether disruption is </w:t>
-      </w:r>
-      <w:r>
-        <w:rPr>
-          <w:rFonts w:ascii="Times New Roman" w:hAnsi="Times New Roman"/>
-          <w:b w:val="0"/>
-          <w:i/>
-          <w:sz w:val="24"/>
-        </w:rPr>
-        <w:t>prevented from being routed into</w:t>
-      </w:r>
-      <w:r>
-        <w:rPr>
-          <w:rFonts w:ascii="Times New Roman" w:hAnsi="Times New Roman"/>
-          <w:b w:val="0"/>
-          <w:i w:val="0"/>
-          <w:sz w:val="24"/>
-        </w:rPr>
-        <w:t xml:space="preserve"> exclusion.</w:t>
-      </w:r>
-    </w:p>
-    <w:p>
-      <w:pPr>
-        <w:spacing w:line="480" w:lineRule="auto" w:before="0" w:after="0"/>
-      </w:pPr>
-      <w:r>
-        <w:rPr>
-          <w:rFonts w:ascii="Times New Roman" w:hAnsi="Times New Roman"/>
-          <w:b w:val="0"/>
-          <w:i w:val="0"/>
-          <w:sz w:val="24"/>
-        </w:rPr>
-        <w:t>The paper makes three contributions. First, it connects previously isolated micro-mechanisms — identity switching, misattribution, defensive othering — into a single damage cascade with welfare institutional design as the upstream condition under which the cascade fires. Second, it explains why the symmetric mirror image of the cascade does not exist: loss aversion, the positional character of status, and the irreversibility of defensive identity investments give welfare design's protective effects a structural ceiling that its damaging effects do not respect. Third, it provides cross-national evidence that the political consequences of welfare design are visible only when welfare is measured by decommodification, not by spending — a finding that directly challenges the buffering model's reliance on generosity levels as the operative variable.</w:t>
+        <w:t>The contribution is threefold. First, the paper connects previously isolated micro-mechanisms (identity switching, misattribution, defensive othering) into a single damage cascade with welfare institutional design as the upstream condition under which the cascade fires. Second, it explains why the symmetric mirror image of that cascade does not exist, grounding the asymmetry in loss aversion, the positional character of status, and the irreversibility of defensive identity investments. Third, it provides cross-national evidence that the political consequences of welfare design are visible only when welfare is measured by decommodification rather than by spending; a finding that challenges the buffering model's reliance on generosity levels as the operative variable, and that points the empirical agenda toward dimensions of welfare design that have been treated as descriptive detail rather than the place where the political action is.</w:t>
       </w:r>
     </w:p>
     <w:p>
@@ -438,7 +402,7 @@
           <w:i w:val="0"/>
           <w:sz w:val="24"/>
         </w:rPr>
-        <w:t xml:space="preserve"> Gallego and Kurer (2022) identify what they call a "concerning finding" from Gingrich's (2019) comparative study — the only careful cross-national analysis assessing whether public policies aimed at alleviating labour market risks for automation-exposed workers can prevent the political turn to protest voting. Gingrich finds that workers highly exposed to automation are not less likely to vote for populist parties in countries with more generous early retirement policies, more in-kind spending, or more protective labour market regulation. If the buffering model were correct, more generous welfare states should show weaker automation-to-populism effects. They do not.</w:t>
+        <w:t xml:space="preserve"> Gallego and Kurer (2022) flag what they call a "concerning finding" from Gingrich's (2019) comparative study, the only careful cross-national analysis testing whether public policies aimed at alleviating labour market risks for automation-exposed workers prevent the political turn to protest voting. Gingrich finds that workers highly exposed to automation are not less likely to vote for populist parties in countries with more generous early retirement policies, more in-kind spending, or more protective labour market regulation. If the buffering model were correct, more generous welfare states should show weaker automation-to-populism effects. They do not.</w:t>
       </w:r>
     </w:p>
     <w:p>
@@ -461,7 +425,7 @@
           <w:i w:val="0"/>
           <w:sz w:val="24"/>
         </w:rPr>
-        <w:t xml:space="preserve"> Stutzmann (2025) examines Germany's coal phase-out, a case where affected communities received substantial compensatory investment and where both compensation and interest group representation were fulfilled. Material conditions held; affected municipalities nonetheless showed higher abstention rates and lower support for the issue-owning party. Bergman (2023) theorises "self-undermining" policy feedback effects, whereby welfare interventions visibly benefiting groups that potential radical right voters view unfavourably can catalyse greater support for the radical right. Fetzer's (2019) analysis of Brexit makes the channel explicit: welfare cuts predicted Leave support through the erosion of political trust and efficacy, not through material deprivation. The institutional channel is doing the political work.</w:t>
+        <w:t xml:space="preserve"> Stutzmann (2025) examines Germany's coal phase-out, a case where affected communities received substantial compensatory investment and where both compensation and interest group representation were fulfilled. Material conditions held; affected municipalities nonetheless showed higher abstention rates and lower support for the issue-owning party. Bergman (2023) theorises "self-undermining" policy feedback effects, whereby welfare interventions visibly benefiting groups that potential radical right voters view unfavourably can catalyse greater support for the radical right. Fetzer's (2019) analysis of Brexit makes the channel explicit: welfare cuts predicted Leave support through the erosion of political trust and efficacy, rather than through material deprivation. The institutional channel is doing the political work.</w:t>
       </w:r>
     </w:p>
     <w:p>
@@ -484,7 +448,7 @@
           <w:i w:val="0"/>
           <w:sz w:val="24"/>
         </w:rPr>
-        <w:t xml:space="preserve"> Pelc (2025) demonstrates that a sizeable portion of workers resist being compensated out of work even when the compensation fully replaces their income — preferring reduced hours over unemployment at the same pay, and compensation from employers over identical compensation from government. The form, source, and meaning of compensation carry political weight independently of its material content. As Guriev (2024) observes, compensating the losers of economic transformation has proven much harder than economists assumed — not because of insufficient resources, but because of political and institutional constraints the buffering framework does not theorise. Kuziemko (2023) makes the complementary point on the demand side: less-educated voters in the United States prefer predistribution — wage protection, work supports — over redistribution as such, suggesting that the resistance Pelc documents is not anomalous but characteristic.</w:t>
+        <w:t xml:space="preserve"> Pelc (2025) shows that a sizeable portion of workers resist being compensated out of work even when the compensation fully replaces their income, preferring reduced hours over unemployment at the same pay, and compensation from employers over identical compensation from government. The form, source, and meaning of compensation carry political weight independently of its material content. As Guriev (2024) observes, compensating the losers of economic transformation has proven much harder than economists assumed, not because of insufficient resources, but because of political and institutional constraints the buffering framework does not theorise. Kuziemko (2023) makes the complementary point on the demand side. Less-educated voters in the United States prefer predistribution (wage protection, work supports) over redistribution as such, suggesting the resistance Pelc documents is characteristic rather than anomalous.</w:t>
       </w:r>
     </w:p>
     <w:p>
@@ -498,7 +462,7 @@
           <w:i w:val="0"/>
           <w:sz w:val="24"/>
         </w:rPr>
-        <w:t xml:space="preserve">The most careful recent empirical case for the buffering account is also worth direct engagement. Burgoon and Schakel (2022) find that welfare generosity is associated with reduced anti-globalization nationalism in European party platforms. Their result is real and their measurement careful, and the apparent contradiction with this paper's null on welfare spending dissolves once the units of analysis are kept distinct. Burgoon and Schakel measure platform language at the party level; the analysis here measures attitudinal slopes at the individual level conditional on automation exposure. The mechanisms that translate aggregate welfare effort into party platforms — elite incentives, coalition arithmetic, electoral targeting — are different from the mechanisms that translate institutional encounter into individual self-concept and exclusionary attitudes. Both findings can be true: welfare generosity at scale may dampen the </w:t>
+        <w:t xml:space="preserve">Burgoon and Schakel (2022) provide the most careful recent empirical case for the buffering account, and the apparent contradiction with this paper's null on welfare spending is worth resolving directly. They find welfare generosity associated with reduced anti-globalization nationalism in European party platforms. Their result is real and their measurement careful. The contradiction dissolves once the units of analysis are kept distinct: Burgoon and Schakel measure platform language at the party level, while the analysis here measures attitudinal slopes at the individual level conditional on automation exposure. The mechanisms that translate aggregate welfare effort into party platforms (elite incentives, coalition arithmetic, electoral targeting) differ from the mechanisms that translate institutional encounter into individual self-concept and exclusionary attitudes. Both findings can be true. Welfare generosity at scale may dampen the </w:t>
       </w:r>
       <w:r>
         <w:rPr>
@@ -534,7 +498,7 @@
           <w:i w:val="0"/>
           <w:sz w:val="24"/>
         </w:rPr>
-        <w:t xml:space="preserve"> for exclusionary attitudes among vulnerable workers responds to a different welfare dimension entirely. The contribution of this paper is precisely to identify that dimension as decommodification rather than spending effort, and to locate it at the individual rather than party level.</w:t>
+        <w:t xml:space="preserve"> for exclusionary attitudes among vulnerable workers responds to a different welfare dimension entirely. The contribution of this paper is to identify that dimension as decommodification rather than spending effort, and to locate it at the individual rather than party level.</w:t>
       </w:r>
     </w:p>
     <w:p>
@@ -548,7 +512,7 @@
           <w:i w:val="0"/>
           <w:sz w:val="24"/>
         </w:rPr>
-        <w:t>The buffering model is not entirely wrong. Albanese et al. (2021) find that EU structural fund disbursements reduce populist voting in recipient regions, suggesting that visible, tangible local investment can work where individualised transfers cannot. The finding cuts the same way as the asymmetric argument developed below: what the spending says about recipients, and about their relationship to the political community, is what does the work. Spending effort alone is too coarse, and the data the rest of this paper presents will show that the dimension along which welfare design's political effects actually travel is not symmetric in the way the buffering framework assumes.</w:t>
+        <w:t>The buffering model is not entirely wrong. Albanese et al. (2021) find that EU structural fund disbursements reduce populist voting in recipient regions, suggesting visible, tangible local investment can work where individualised transfers cannot. The finding cuts the same way as the asymmetric argument developed below. What the spending says about recipients, and about their relationship to the political community, is what does the work. Spending effort alone is too coarse.</w:t>
       </w:r>
     </w:p>
     <w:p>
@@ -589,7 +553,25 @@
           <w:i w:val="0"/>
           <w:sz w:val="24"/>
         </w:rPr>
-        <w:t>The central empirical pattern this paper documents in §V is asymmetric. Welfare institutional context moderates the conversion of automation exposure into anti-immigration sentiment: the slope is significantly steeper in Liberal regimes than Nordic ones, and this moderation tracks decommodification rather than spending effort. Welfare institutional context does not detectably moderate the conversion of the same exposure into redistributive solidarity: RTI predicts slightly higher redistribution support across all regimes, but the cross-regime interaction is small and non-significant, and a supplementary ISSP analysis (Appendix C) returns the same null on a different sample and a different outcome variable. The damage mechanism is legible. The protective mechanism is not.</w:t>
+        <w:t xml:space="preserve">The central empirical pattern of §V is asymmetric. Welfare institutional context moderates the conversion of automation exposure into anti-immigration sentiment: the slope is significantly steeper in Liberal regimes than in Nordic ones, and the moderation tracks decommodification rather than spending effort. It does </w:t>
+      </w:r>
+      <w:r>
+        <w:rPr>
+          <w:rFonts w:ascii="Times New Roman" w:hAnsi="Times New Roman"/>
+          <w:b w:val="0"/>
+          <w:i/>
+          <w:sz w:val="24"/>
+        </w:rPr>
+        <w:t>not</w:t>
+      </w:r>
+      <w:r>
+        <w:rPr>
+          <w:rFonts w:ascii="Times New Roman" w:hAnsi="Times New Roman"/>
+          <w:b w:val="0"/>
+          <w:i w:val="0"/>
+          <w:sz w:val="24"/>
+        </w:rPr>
+        <w:t xml:space="preserve"> detectably moderate the conversion of the same exposure into redistributive solidarity. RTI predicts slightly higher redistribution support across all regimes, but the cross-regime interaction is small and non-significant, and a supplementary ISSP analysis (Appendix C) returns the same null on a different sample and a different outcome variable. The damage mechanism is legible. The protective one is not.</w:t>
       </w:r>
     </w:p>
     <w:p>
@@ -603,7 +585,7 @@
           <w:i w:val="0"/>
           <w:sz w:val="24"/>
         </w:rPr>
-        <w:t>The natural response is to treat the solidarity null as a measurement problem — a single-item redistribution scale, an insufficiently sensitive panel, missing mediators. The supplementary analysis suggests the null survives alternative specifications, and I take the asymmetry as real and theorise accordingly. The mechanism this paper proposes is not a symmetric sorting machine that routes vulnerability into solidarity or exclusion depending on institutional quality. It is a one-way filter. Welfare institutions can fail politically, in a specific and cumulative way. They cannot, by symmetric operation, succeed.</w:t>
+        <w:t>The natural response is to treat the solidarity null as a measurement problem; a single-item redistribution scale, an insufficiently sensitive panel, missing mediators. The supplementary analysis suggests the null is robust to a few obvious alternatives, and on my reading it is also robust to the more defensible interpretation, which is that the mechanism itself is asymmetric. The picture I want to defend is not a symmetric sorting machine that routes vulnerability into solidarity or exclusion depending on the quality of the institutions filtering it. It is a one-way filter. Welfare institutions can fail politically, in a specific and cumulative way. By symmetric operation, they cannot succeed.</w:t>
       </w:r>
     </w:p>
     <w:p>
@@ -617,7 +599,7 @@
           <w:i w:val="0"/>
           <w:sz w:val="24"/>
         </w:rPr>
-        <w:t xml:space="preserve">I should note that this is a stronger claim than the symmetric sorting account, and it turns out to be the claim a careful reading of the recognition literature has been making for some time. Gidron and Hall (2017, p. 26) find that right-populist voters "care as much, or even more, about recognition as about redistribution" — and that compensation "is not what these people are looking for." Kurer and Palier (2019) make a complementary observation in the routine-worker context specifically: routine workers demand "economic </w:t>
+        <w:t xml:space="preserve">This is a stronger claim than the symmetric sorting account, and one a careful reading of the recognition literature has been working toward for some time. Gidron and Hall (2017, p. 26) find that right-populist voters "care as much, or even more, about recognition as about redistribution," and that compensation "is not what these people are looking for." Kurer and Palier (2019) make the complementary observation in the routine-worker context; what routine workers demand is "economic </w:t>
       </w:r>
       <w:r>
         <w:rPr>
@@ -635,7 +617,7 @@
           <w:i w:val="0"/>
           <w:sz w:val="24"/>
         </w:rPr>
-        <w:t xml:space="preserve"> cultural protection" of which the latter cannot be supplied through transfer payments alone. The buffering framework, which assumes redistribution and recognition are fungible, has no way to accommodate this finding. The asymmetric mechanism theorised below takes it as the starting point.</w:t>
+        <w:t xml:space="preserve"> cultural protection," and the second of those cannot be supplied through transfer payments. The buffering framework treats redistribution and recognition as fungible. They are not. The asymmetric mechanism developed below takes the non-fungibility as its starting point.</w:t>
       </w:r>
     </w:p>
     <w:p>
@@ -663,7 +645,7 @@
           <w:i w:val="0"/>
           <w:sz w:val="24"/>
         </w:rPr>
-        <w:t>A reasonable objection at this point is that many institutions shape identity. Media environments construct group boundaries; religious traditions supply moral narratives; class structures generate interest coalitions. Why isolate welfare as the mediator that converts economic disruption into exclusionary politics?</w:t>
+        <w:t>The obvious objection at this point is that many institutions shape identity. Media environments construct group boundaries. Religious traditions supply moral narratives. Class structures generate interest coalitions. Why isolate welfare, and not any of these other plausible candidates?</w:t>
       </w:r>
     </w:p>
     <w:p>
@@ -677,7 +659,7 @@
           <w:i w:val="0"/>
           <w:sz w:val="24"/>
         </w:rPr>
-        <w:t xml:space="preserve">Welfare is the single state domain where economic vulnerability and institutional treatment meet. Other institutions shape identity, but welfare is the one whose verdict has material and symbolic force simultaneously. When a worker encounters the welfare state, the institution is allocating resources </w:t>
+        <w:t xml:space="preserve">The answer is that welfare is the single state domain where economic vulnerability and institutional treatment meet. Other institutions shape identity, certainly, but welfare is the one whose verdict has material and symbolic force at the same time. When a worker encounters the welfare state, the institution allocates resources </w:t>
       </w:r>
       <w:r>
         <w:rPr>
@@ -695,7 +677,7 @@
           <w:i w:val="0"/>
           <w:sz w:val="24"/>
         </w:rPr>
-        <w:t xml:space="preserve"> rendering a judgement about the worker's claim to those resources. That joint operation is unusual. Courts render judgement but rarely allocate resources to the individual judged; markets allocate without judgement; religious institutions judge but cannot compel. Only welfare does both, and it does them to people at the point of their maximum material dependence.</w:t>
+        <w:t xml:space="preserve"> renders a judgement about that worker's claim to those resources, in the same act and at the same moment. This joint operation is what other identity-shaping institutions cannot match. Courts render judgement but rarely allocate resources to the individual judged. Markets allocate without judgement, or pretend to. Religious institutions render judgement but cannot compel. Only welfare does both, and it does them at the point of a person's maximum material dependence; which is also, not coincidentally, the point at which a person is least equipped to resist what the institution communicates about them.</w:t>
       </w:r>
     </w:p>
     <w:p>
@@ -709,7 +691,25 @@
           <w:i w:val="0"/>
           <w:sz w:val="24"/>
         </w:rPr>
-        <w:t>This joint operation is what makes welfare uniquely load-bearing as a communicator of citizen worth. Wagner's (2022) finding that recipients learn and mirror the recognition norms the state enacts on them is intelligible only under these conditions: because the encounter is materially consequential and judgement-laden, recipients cannot dismiss the signal as one view among many. They have to metabolise it. Soss (1999) documents the specific learning that follows: programmes with respectful implementation foster civic engagement, while programmes characterised by surveillance and conditionality generate alienation. De Blok and Kumlin (2022) extend the point — procedural fairness preserves institutional trust most strongly for those whose outcomes are unfavourable, meaning implementation quality is most consequential precisely for those already economically vulnerable. What the welfare state says about you, when you encounter it, is part of what you know about yourself.</w:t>
+        <w:t xml:space="preserve">This joint operation produces the conditions under which welfare becomes load-bearing as a communicator of citizen worth. Wagner's (2022) finding that recipients learn and mirror the recognition norms the state enacts on them is intelligible only under these conditions: because the encounter is materially consequential </w:t>
+      </w:r>
+      <w:r>
+        <w:rPr>
+          <w:rFonts w:ascii="Times New Roman" w:hAnsi="Times New Roman"/>
+          <w:b w:val="0"/>
+          <w:i/>
+          <w:sz w:val="24"/>
+        </w:rPr>
+        <w:t>and</w:t>
+      </w:r>
+      <w:r>
+        <w:rPr>
+          <w:rFonts w:ascii="Times New Roman" w:hAnsi="Times New Roman"/>
+          <w:b w:val="0"/>
+          <w:i w:val="0"/>
+          <w:sz w:val="24"/>
+        </w:rPr>
+        <w:t xml:space="preserve"> judgement-laden, recipients cannot dismiss the signal as one view among many. They have to metabolise it. Soss (1999) documents the specific learning that follows. Programmes with respectful implementation foster civic engagement; programmes characterised by surveillance and conditionality generate alienation, and the alienation persists. De Blok and Kumlin (2022) extend the point with a finding worth dwelling on. Procedural fairness preserves institutional trust most strongly for those whose outcomes are unfavourable, which means implementation quality matters most precisely for those who are most economically vulnerable. The implication is one Banerjee and Duflo (2019) pose as a normative goal but which, in this paper's framing, is also a positive-empirical claim: what the welfare state says about you, when you encounter it, is part of what you know about yourself.</w:t>
       </w:r>
     </w:p>
     <w:p>
@@ -723,7 +723,7 @@
           <w:i w:val="0"/>
           <w:sz w:val="24"/>
         </w:rPr>
-        <w:t>The implication for the empirical analysis is precise. If welfare institutions shape the self-concept of vulnerable workers, they should exert their strongest influence where vulnerability is highest and institutional contact most concrete. Routine-task-intensive workers satisfy both conditions simultaneously — their material position is eroding, and they are disproportionately represented in the caseloads of visible welfare systems. The cross-national pattern is visible in ESS data because the sample contains the population where the mechanism should have the most purchase.</w:t>
+        <w:t>If welfare institutions shape the self-concept of vulnerable workers, the influence should be strongest where vulnerability is highest and institutional contact most concrete. Routine-task-intensive workers satisfy both conditions at once. Their material position is eroding, and they are disproportionately represented in the caseloads of visible welfare systems. This is why the cross-national pattern is detectable in ESS data; the sample contains the population on which the mechanism should have the most purchase.</w:t>
       </w:r>
     </w:p>
     <w:p>
@@ -737,7 +737,7 @@
           <w:i w:val="0"/>
           <w:sz w:val="24"/>
         </w:rPr>
-        <w:t>Welfare institutions reach beyond their direct caseloads through three further pathways that scale the recipient-level mechanism to population-level attitudes. Workers aware of their exposure to economic disruption factor anticipated future dependency into present self-understanding, and welfare institutions are the most legible signal of what that dependency will look like. How the welfare state treats its recipients shapes how welfare is talked about in political speech, in journalism, and at the dinner table — and that discourse reaches well beyond the recipient caseload, mirroring at the population level the recognition norms Wagner (2022) documents at the recipient level. And the population most exposed to automation is also the population most likely to encounter, or to anticipate encountering, visible welfare systems. The aggregation from recipient experience to population-level attitudes is neither instantaneous nor lossless, but it is what Wagner and Soss (1999) mean when they describe welfare as a site of political socialisation that reaches beyond the encounter itself. A second, structurally distinct channel operates through the "submerged state" (Mettler 2011) — tax expenditures and indirect benefits serving middle and upper-income groups that remain invisible as government assistance. Recipients of submerged welfare attribute their security to personal merit; recipients of visible welfare are marked as dependents; the asymmetry produces a political identity fracture in which a large share of the population benefits from the welfare state without recognising it, developing meritocratic beliefs structurally at odds with solidarity.</w:t>
+        <w:t>Three further pathways extend the mechanism beyond direct recipients. The first is anticipation. Workers aware of their exposure to economic disruption factor anticipated future dependency into present self-understanding, and welfare institutions are the most legible signal of what that future dependency will look like. The second is narrative. How the welfare state treats its recipients shapes how welfare is talked about in political speech, in journalism, and at the dinner table, mirroring at the population level the recognition norms Wagner (2022) documents at the recipient level. The third is concentration. The population most exposed to automation is also the population most likely to have encountered, or to anticipate encountering, visible welfare systems. None of these aggregation pathways is instantaneous or lossless, but they are what Wagner and Soss mean when they describe welfare as a site of political socialisation that reaches beyond the encounter itself. A structurally distinct fourth channel runs through what Mettler (2011) calls the "submerged state"; tax expenditures and indirect benefits serving middle and upper-income groups that remain invisible as government assistance. Recipients of submerged welfare attribute their security to personal merit. Recipients of visible welfare are marked as dependents. The two groups look at the same welfare state but see different institutions, and the gap between what they see produces a political identity fracture: a large share of the population benefits from the welfare state without recognising it, developing meritocratic beliefs structurally at odds with the solidarity the welfare state would, in a more legible form, plausibly produce.</w:t>
       </w:r>
     </w:p>
     <w:p>
@@ -765,7 +765,7 @@
           <w:i w:val="0"/>
           <w:sz w:val="24"/>
         </w:rPr>
-        <w:t>When welfare institutions damage the self-concept, three responses follow, each building on, and harder to reverse than, the last.</w:t>
+        <w:t>When welfare institutions damage the self-concept, three responses follow. Each builds on, and is harder to reverse than, the one before.</w:t>
       </w:r>
     </w:p>
     <w:p>
@@ -779,7 +779,25 @@
           <w:i w:val="0"/>
           <w:sz w:val="24"/>
         </w:rPr>
-        <w:t>First, identity switches. Bonomi, Gennaioli, and Tabellini (2021) model how individuals move from class to cultural identity when class identity is degraded by economic disruption, and under cultural identity redistribution demand decreases while cultural conservatism intensifies. The welfare state enters at a specific point: stigmatising implementation degrades class identity directly, accelerating the switch. A worker entering a system that treats retraining as a citizenship right retains class identity; one entering a system of means-testing and surveillance has that identity doubly damaged. Ballard-Rosa, Jensen, and Scheve (2022) supply the downstream evidence: economic decline activates social identity processes producing authoritarian values through group status threat. Welfare institutional mediation, I argue, is the missing upstream variable — it determines whether the pathway they document actually fires. Im (2023) provides further confirmation in panel data from Finland: expected status decline, not material hardship as such, drives the radical right shift among routine workers, and the expectations workers form about their future status are themselves shaped by what they observe of how the state treats people in their position.</w:t>
+        <w:t xml:space="preserve">The first is identity. Bonomi, Gennaioli, and Tabellini (2021) model how individuals move from class to cultural identity when class identity is degraded by economic disruption, and under cultural identity, redistribution demand decreases while cultural conservatism intensifies. The welfare state enters this model at a specific point. Stigmatising implementation degrades class identity directly, accelerating the switch. A worker entering a system that treats retraining as a citizenship right retains class identity; a worker entering a system of means-testing and surveillance has that identity doubly damaged, both by the disruption that brought him into contact with the system, and by the system's response to him once he is inside it. Ballard-Rosa, Jensen, and Scheve (2022) provide the downstream evidence; economic decline activates social identity processes producing authoritarian values through group status threat, and welfare institutional mediation, I argue, is the missing upstream variable. It determines whether the pathway they document actually fires. Im (2023) supplies further confirmation in panel data from Finland; it is </w:t>
+      </w:r>
+      <w:r>
+        <w:rPr>
+          <w:rFonts w:ascii="Times New Roman" w:hAnsi="Times New Roman"/>
+          <w:b w:val="0"/>
+          <w:i/>
+          <w:sz w:val="24"/>
+        </w:rPr>
+        <w:t>expected</w:t>
+      </w:r>
+      <w:r>
+        <w:rPr>
+          <w:rFonts w:ascii="Times New Roman" w:hAnsi="Times New Roman"/>
+          <w:b w:val="0"/>
+          <w:i w:val="0"/>
+          <w:sz w:val="24"/>
+        </w:rPr>
+        <w:t xml:space="preserve"> status decline, not material hardship as such, that drives the radical right shift among routine workers. The expectations workers form about their future status are themselves shaped by what they observe of how the state treats people in their position.</w:t>
       </w:r>
     </w:p>
     <w:p>
@@ -793,7 +811,7 @@
           <w:i w:val="0"/>
           <w:sz w:val="24"/>
         </w:rPr>
-        <w:t>Once cultural identity is in charge, grievances misattribute. Economic frustration gets pointed at cognitively available scapegoats. Gallego and Kurer (2022) identify three factors: psychological gratification from blaming outgroups, political supply of anti-immigrant narratives, and automation's gradual invisibility. Wu (2022) confirms empirically that workers at higher automation risk oppose immigration but show no different technology preferences — a misdirection of blame that has no analogue on the protective side of the mechanism. Alesina and Angeletos (2005) add that conditional welfare systems produce individual rather than structural attributions, predisposing people to search for someone getting something undeserved before they search for structural explanations.</w:t>
+        <w:t>Once cultural identity is in charge, grievances misattribute. Economic frustration gets pointed at cognitively available scapegoats. Gallego and Kurer (2022) identify three factors compounding to produce this: psychological gratification from blaming outgroups, political supply of anti-immigrant narratives, and automation's gradual invisibility as a target of blame. Wu (2022) confirms the misdirection empirically; workers at higher automation risk oppose immigration but show no different technology preferences. A worker pointed at the actual cause of his vulnerability does not respond politically; a worker pointed at a substitute for the actual cause does. There is no analogue of this misdirection on the protective side of the mechanism, no condition under which structural attribution emerges in workers as a substitute for cultural attribution they would otherwise have made. Alesina and Angeletos (2005) provide the institutional anchor for the asymmetry: conditional welfare systems produce individual rather than structural attributions, predisposing people to look for someone getting something undeserved before they look for structural explanations of why they themselves are not getting something they expected.</w:t>
       </w:r>
     </w:p>
     <w:p>
@@ -807,7 +825,7 @@
           <w:i w:val="0"/>
           <w:sz w:val="24"/>
         </w:rPr>
-        <w:t>The final move is defensive: othering. Patrick (2016) documents UK benefit claimants shoring up their own deservingness through critique of those below them, using the same criteria the welfare system applied to them. Wagner (2022) calls this "kicking down" and documents its institutional origins. Im and Komp-Leukkunen (2021) connect it to automation: routine workers support strict conditionality because it maintains status distance from groups below them, not because strict conditionality is in their material interest. Häusermann, Kurer, and Zollinger (2023) find that conservative-authoritarian voters are typically "a few rungs up" from the bottom — close enough to feel the proximity as a threat. The cascade ends in a configuration Busemeyer, Rathgeb, and Sahm (2023) name precisely: the "particularistic-authoritarian" welfare preference — pro-workfare, anti-poor, anti-social-investment — which is, in this paper's language, the political programme of a self-concept the welfare state itself has helped construct.</w:t>
+        <w:t>The third move is defensive: othering. Patrick (2016) documents what this looks like at the recipient level; UK benefit claimants shoring up their own deservingness through critique of those below them, using the same criteria the welfare system applied to them. Wagner (2022) calls this "kicking down" and documents its institutional origins; Im and Komp-Leukkunen (2021) connect it to automation directly. Routine workers support strict conditionality because it maintains status distance from groups below them, not because strict conditionality is in their material interest. Häusermann, Kurer, and Zollinger (2023) place the same configuration in the broader voter population; conservative-authoritarian voters are typically "a few rungs up" from the bottom, close enough to feel the proximity as a threat. The cascade ends in a configuration Busemeyer, Rathgeb, and Sahm (2023) have named precisely; the "particularistic-authoritarian" welfare preference: pro-workfare, anti-poor, anti-social-investment. In this paper's language, that configuration is the political programme of a self-concept the welfare state has helped construct, and which the welfare state's continued operation continues to confirm.</w:t>
       </w:r>
     </w:p>
     <w:p>
@@ -835,7 +853,7 @@
           <w:i w:val="0"/>
           <w:sz w:val="24"/>
         </w:rPr>
-        <w:t>The symmetric account would predict that welfare institutions which preserve the self-concept produce solidarity through a mirror-image cascade: stable identity, structural attribution, inclusive deservingness. The paper's empirical null on the solidarity side says otherwise. The asymmetry is not a limitation of the data; it is what the mechanism, taken seriously, predicts.</w:t>
+        <w:t>The symmetric account would predict that welfare institutions which preserve the self-concept produce solidarity through a mirror-image cascade: stable identity, structural attribution, inclusive deservingness. The paper's empirical null on the solidarity side says otherwise. This isn't a limitation of the data; it is what the mechanism, taken seriously, predicts.</w:t>
       </w:r>
     </w:p>
     <w:p>
@@ -849,7 +867,7 @@
           <w:i w:val="0"/>
           <w:sz w:val="24"/>
         </w:rPr>
-        <w:t xml:space="preserve">Three asymmetries carry the argument. The first is loss aversion. Kahneman and Tversky's finding — that losses loom larger than equivalent gains in psychological and political evaluation — applies directly to dignity shocks. Stigmatising welfare encounters register as status losses. Dignity-preserving encounters do not register as status gains of equivalent magnitude; they register as the absence of damage. The political asymmetry follows: damage mobilises, the absence of damage does not. Kurer and van Staalduinen (2022) provide partial empirical support in the related domain of intergenerational status discordance, where the political consequences of unmet expectations are detectable while the consequences of </w:t>
+        <w:t xml:space="preserve">Three different things are wrong with the symmetric picture, and they are wrong in different ways. Loss aversion comes first. Kahneman and Tversky's finding, that losses loom larger than equivalent gains in evaluation, applies directly to dignity shocks. A stigmatising welfare encounter registers as a status loss; a dignity-preserving encounter does not register as a status </w:t>
       </w:r>
       <w:r>
         <w:rPr>
@@ -858,7 +876,7 @@
           <w:i/>
           <w:sz w:val="24"/>
         </w:rPr>
-        <w:t>exceeded</w:t>
+        <w:t>gain</w:t>
       </w:r>
       <w:r>
         <w:rPr>
@@ -867,7 +885,7 @@
           <w:i w:val="0"/>
           <w:sz w:val="24"/>
         </w:rPr>
-        <w:t xml:space="preserve"> expectations are markedly weaker. The asymmetry I am theorising is the same asymmetry one rung up: institutional recognition shocks register, institutional recognition baselines do not.</w:t>
+        <w:t xml:space="preserve"> of equivalent magnitude. What it produces is the absence of damage, which has a different psychological signature and a different political one. Damage mobilises; the absence of damage tends not to. Kurer and van Staalduinen (2022) document a closely related asymmetry in intergenerational status discordance, where voters whose expectations are unmet show large political shifts while voters whose expectations are exceeded show much weaker ones. The asymmetry this paper theorises is the same asymmetry one rung up. Institutional recognition shocks register; institutional recognition baselines do not.</w:t>
       </w:r>
     </w:p>
     <w:p>
@@ -881,7 +899,7 @@
           <w:i w:val="0"/>
           <w:sz w:val="24"/>
         </w:rPr>
-        <w:t>The second is the positional character of status. Status is not a resource one can have more of without someone else having less. Gidron and Hall (2017) make the point exactly: what right-populist voters want is not redistribution in the material sense but recognition in the relational sense, and relational goods cannot be redistributed without losses to the currently-recognised. Solidarity premised on shared citizenship works only if the in-group is drawn widely enough to include the structurally similar — the unemployed, the immigrant, the welfare recipient. Dignity-preserving welfare removes one obstacle to such inclusion, but it does not construct inclusion itself. Active solidarity requires political work that welfare design alone cannot do: coalitional framing, mobilisation, narrative construction (Iversen and Soskice 2001; Rothstein 2001; Larsen 2008). The absence of damage is necessary but not sufficient.</w:t>
+        <w:t>Second, status, unlike redistribution, is positional. There is no quantity of status one person can have without another person having less. Gidron and Hall (2017) make the point exactly: what right-populist voters want is not redistribution in the material sense but recognition in the relational sense, and relational goods cannot be redistributed without losses to the currently-recognised. Dignity-preserving welfare removes an obstacle to inclusive solidarity; it does not, by itself, construct the inclusion. Active solidarity requires political work that welfare design alone cannot do, including coalitional framing, mobilisation, and narrative construction (Iversen and Soskice 2001; Rothstein 2001; Larsen 2008). What welfare provides is permission, not propulsion.</w:t>
       </w:r>
     </w:p>
     <w:p>
@@ -895,7 +913,7 @@
           <w:i w:val="0"/>
           <w:sz w:val="24"/>
         </w:rPr>
-        <w:t>The third is the irreversibility of defensive othering. Once a worker has built their own deservingness on critique of those below them, the identity investment is costly to reverse. The cascade is cumulative in a specific sense: each stage commits the individual to the next, and un-committing requires not just institutional change but the undoing of identity work that has already happened. This is what it means to call the recursive loop one-directional. The cascade forms a self-sustaining system. Conditional welfare damages self-concepts. Damaged self-concepts produce othering. Othering generates public attitudes supporting further conditionality. Political entrepreneurs respond with welfare chauvinism. Further conditionality deepens the damage. Pierson's (1994) positive feedback describes constituencies whose identities and material interests grow into support for policies they benefit from. The damage cascade is its photographic negative — constituencies whose identities grow into opposition to policies that would serve them, and whose identity investments make reversal harder than it would be under any model of rational updating. Haugsgjerd and Kumlin's (2020) "downbound spiral" captures the individual-level version of this process in panel data; Van Hootegem, Abts, and Meuleman (2021) document its attitudinal signature in the simultaneous embrace of redistribution in principle and distrust of the welfare state in practice. That gap is the space the radical right occupies, and it opens through damage, not through the symmetric absence of protection. The loop also makes the damage self-concealing: because the welfare state produces the attitudes that legitimate its retrenchment, each iteration appears more natural, and preferences that are outputs of policy appear as inputs.</w:t>
+        <w:t>Third, defensive othering, once committed to, is costly to reverse. A worker who has built their own deservingness on critique of those below them has made an identity investment, and identity investments are not undone by changing the institutional environment alone; they require the un-doing of identity work that has already happened. This is what makes the recursive loop one-directional. The cascade is self-sustaining at every step. Conditional welfare damages self-concepts. Damaged self-concepts produce othering. Othering generates public attitudes supporting further conditionality. Political entrepreneurs respond with welfare chauvinism, and further conditionality deepens the damage. Each round looks like the next round's premise. Pierson's (1994) positive feedback describes constituencies whose identities and material interests grow into support for policies they benefit from; the damage cascade runs the other way, with constituencies whose identities grow into opposition to policies that would serve them, where the reversal is harder than rational-updating models predict because what would have to be reversed is not a belief but a self. Haugsgjerd and Kumlin's (2020) "downbound spiral" picks up the individual-level signature in panel data; Van Hootegem, Abts, and Meuleman (2021) name the attitudinal contradiction it produces, with citizens simultaneously endorsing redistribution in principle and distrusting the welfare state in practice. That gap is the space the radical right occupies. The damage is also self-concealing, because the welfare state produces the attitudes that legitimate its retrenchment, and each iteration appears more natural than the last. Preferences that are outputs of the policy come to appear as inputs to it.</w:t>
       </w:r>
     </w:p>
     <w:p>
@@ -909,7 +927,7 @@
           <w:i w:val="0"/>
           <w:sz w:val="24"/>
         </w:rPr>
-        <w:t>Dignity, put plainly, is a baseline good. Its absence damages in observable, measurable, recursive ways. Its presence clears the ground for solidarity without producing it.</w:t>
+        <w:t>Three asymmetries, none with a mirror image. Dignity is a baseline good. Its absence damages, observably, measurably, recursively. Its presence clears the ground for a solidarity that has to be built on top, by other means.</w:t>
       </w:r>
     </w:p>
     <w:p>
@@ -937,7 +955,7 @@
           <w:i w:val="0"/>
           <w:sz w:val="24"/>
         </w:rPr>
-        <w:t>The theory generates five observable implications. Three are tested in this paper; two motivate the causal follow-up.</w:t>
+        <w:t>A theory of this shape has to be testable, and the asymmetry generates predictions sharp enough to fail. Three are tested in this paper. Two motivate the causal follow-up.</w:t>
       </w:r>
     </w:p>
     <w:p>
@@ -951,7 +969,79 @@
           <w:i w:val="0"/>
           <w:sz w:val="24"/>
         </w:rPr>
-        <w:t>Cross-national variation in exclusion should track dimensions of welfare design that bear directly on dignity — decommodification, implementation conditionality, the punitive-enabling balance of active labour market policy (Van Hootegem 2025). It should not track welfare spending effort, because spending is orthogonal to dignity: generous workfare exists, and so does thin universalism. This is the ALMP vs CWED contrast of §V.D.</w:t>
+        <w:t xml:space="preserve">Cross-national variation in </w:t>
+      </w:r>
+      <w:r>
+        <w:rPr>
+          <w:rFonts w:ascii="Times New Roman" w:hAnsi="Times New Roman"/>
+          <w:b w:val="0"/>
+          <w:i/>
+          <w:sz w:val="24"/>
+        </w:rPr>
+        <w:t>exclusion</w:t>
+      </w:r>
+      <w:r>
+        <w:rPr>
+          <w:rFonts w:ascii="Times New Roman" w:hAnsi="Times New Roman"/>
+          <w:b w:val="0"/>
+          <w:i w:val="0"/>
+          <w:sz w:val="24"/>
+        </w:rPr>
+        <w:t xml:space="preserve"> should track dimensions of welfare design that bear on dignity, including decommodification, implementation conditionality, and the punitive-enabling balance of active labour market policy (Van Hootegem 2025). It should not track welfare spending effort, because spending is orthogonal to dignity. Generous workfare exists; thin universalism exists. The signal, if the theory is right, runs along the dignity axis rather than the budget axis. This is the prediction tested in §V.D. Cross-national variation in </w:t>
+      </w:r>
+      <w:r>
+        <w:rPr>
+          <w:rFonts w:ascii="Times New Roman" w:hAnsi="Times New Roman"/>
+          <w:b w:val="0"/>
+          <w:i/>
+          <w:sz w:val="24"/>
+        </w:rPr>
+        <w:t>solidarity</w:t>
+      </w:r>
+      <w:r>
+        <w:rPr>
+          <w:rFonts w:ascii="Times New Roman" w:hAnsi="Times New Roman"/>
+          <w:b w:val="0"/>
+          <w:i w:val="0"/>
+          <w:sz w:val="24"/>
+        </w:rPr>
+        <w:t xml:space="preserve"> should not track the same welfare design variables with anything like the same strength, because solidarity requires supply-side construction (political entrepreneurship, coalitional framing, electoral system affordances) that welfare quality alone cannot provide. This is the prediction §V.F is set up to test. The third prediction concerns Nordic exceptionalism; what makes Nordic welfare states distinctive should be the </w:t>
+      </w:r>
+      <w:r>
+        <w:rPr>
+          <w:rFonts w:ascii="Times New Roman" w:hAnsi="Times New Roman"/>
+          <w:b w:val="0"/>
+          <w:i/>
+          <w:sz w:val="24"/>
+        </w:rPr>
+        <w:t>absence of steep exclusion slopes</w:t>
+      </w:r>
+      <w:r>
+        <w:rPr>
+          <w:rFonts w:ascii="Times New Roman" w:hAnsi="Times New Roman"/>
+          <w:b w:val="0"/>
+          <w:i w:val="0"/>
+          <w:sz w:val="24"/>
+        </w:rPr>
+        <w:t xml:space="preserve">, not the </w:t>
+      </w:r>
+      <w:r>
+        <w:rPr>
+          <w:rFonts w:ascii="Times New Roman" w:hAnsi="Times New Roman"/>
+          <w:b w:val="0"/>
+          <w:i/>
+          <w:sz w:val="24"/>
+        </w:rPr>
+        <w:t>presence of redistributive uplift</w:t>
+      </w:r>
+      <w:r>
+        <w:rPr>
+          <w:rFonts w:ascii="Times New Roman" w:hAnsi="Times New Roman"/>
+          <w:b w:val="0"/>
+          <w:i w:val="0"/>
+          <w:sz w:val="24"/>
+        </w:rPr>
+        <w:t>. The data behaves accordingly. Nordic RTI→exclusion slopes are the flattest in Europe, not the steepest in the opposite direction.</w:t>
       </w:r>
     </w:p>
     <w:p>
@@ -965,11 +1055,24 @@
           <w:i w:val="0"/>
           <w:sz w:val="24"/>
         </w:rPr>
-        <w:t>Cross-national variation in solidarity should not track the same welfare design variables with anything like the same strength. Solidarity requires supply-side construction — political entrepreneurship, coalitional framing, electoral system affordances — that welfare quality alone cannot provide. This is the asymmetry of §V.F.</w:t>
+        <w:t>Two further predictions live within rather than across countries, and motivate the registry-based follow-up. If the theory is right, welfare reform introducing conditionality should show damage effects, while welfare reform expanding unconditional generosity should show weaker or null protective effects. The Danish 2003, 2006, and 2013 activation reforms are the clearest test, because each introduced conditionality with the underlying decommodification level held relatively constant. And panel data should detect path-dependence in individual attitudes, with workers who experience a stigmatising welfare encounter showing elevated exclusionary attitudes years later, controlling for subsequent material conditions. None of the five predictions can be fully tested in cross-sectional ESS data. Three are tested here. Two are written here so that, in the thesis, they can be falsified.</w:t>
       </w:r>
     </w:p>
     <w:p>
       <w:pPr>
+        <w:spacing w:before="360" w:after="120" w:line="240" w:lineRule="auto"/>
+      </w:pPr>
+      <w:r>
+        <w:rPr>
+          <w:rFonts w:ascii="Times New Roman" w:hAnsi="Times New Roman"/>
+          <w:b/>
+          <w:sz w:val="24"/>
+        </w:rPr>
+        <w:t>IV. Scope Conditions and Limits</w:t>
+      </w:r>
+    </w:p>
+    <w:p>
+      <w:pPr>
         <w:spacing w:line="480" w:lineRule="auto" w:before="0" w:after="0"/>
       </w:pPr>
       <w:r>
@@ -979,7 +1082,7 @@
           <w:i w:val="0"/>
           <w:sz w:val="24"/>
         </w:rPr>
-        <w:t>Nordic exceptionalism should present as the absence of steep exclusion slopes rather than the presence of redistributive uplift. The data supports this: Nordic RTI→exclusion slopes are the flattest in Europe, not the steepest in the opposite direction.</w:t>
+        <w:t>The asymmetric mechanism does not claim that welfare institutions are the only force shaping the political response to economic disruption. It claims something narrower: that welfare institutions are the institutional condition under which the damage cascade fires, and that no symmetric institutional condition produces a mirror-image solidarity cascade. Both claims need to be bounded.</w:t>
       </w:r>
     </w:p>
     <w:p>
@@ -993,7 +1096,43 @@
           <w:i w:val="0"/>
           <w:sz w:val="24"/>
         </w:rPr>
-        <w:t>Welfare reform introducing conditionality should show damage effects; welfare reform expanding unconditional generosity should show weaker or null protective effects. This prediction motivates the Danish registry follow-up, where the 2003, 2006, and 2013 activation reforms provide within-country variation of the right kind.</w:t>
+        <w:t xml:space="preserve">The most important scope condition is that the absence of damage is necessary for solidarity but not sufficient for it. Universal programmes build social trust (Rothstein 2001) and produce inclusive deservingness narratives (Larsen 2008). Extensive universal provision conveys recognition beyond material security and diminishes zero-sum status perceptions (Häusermann 2024). Nordic welfare states show consistently lower populist support despite globalisation pressures (Norris and Inglehart 2019). All of this is real. The asymmetric framing reads it differently from the buffering model. What these findings record is the </w:t>
+      </w:r>
+      <w:r>
+        <w:rPr>
+          <w:rFonts w:ascii="Times New Roman" w:hAnsi="Times New Roman"/>
+          <w:b w:val="0"/>
+          <w:i/>
+          <w:sz w:val="24"/>
+        </w:rPr>
+        <w:t>baseline</w:t>
+      </w:r>
+      <w:r>
+        <w:rPr>
+          <w:rFonts w:ascii="Times New Roman" w:hAnsi="Times New Roman"/>
+          <w:b w:val="0"/>
+          <w:i w:val="0"/>
+          <w:sz w:val="24"/>
+        </w:rPr>
+        <w:t xml:space="preserve"> dignity-preserving welfare provides, not the active </w:t>
+      </w:r>
+      <w:r>
+        <w:rPr>
+          <w:rFonts w:ascii="Times New Roman" w:hAnsi="Times New Roman"/>
+          <w:b w:val="0"/>
+          <w:i/>
+          <w:sz w:val="24"/>
+        </w:rPr>
+        <w:t>uplift</w:t>
+      </w:r>
+      <w:r>
+        <w:rPr>
+          <w:rFonts w:ascii="Times New Roman" w:hAnsi="Times New Roman"/>
+          <w:b w:val="0"/>
+          <w:i w:val="0"/>
+          <w:sz w:val="24"/>
+        </w:rPr>
+        <w:t xml:space="preserve"> the buffering model assumes. The political work that converts baseline dignity into active solidarity, including coalitional framing, electoral institutions that organise universalist coalitions, and narrative entrepreneurs, is out of scope for this paper. Bornschier, Haffert, and Häusermann (2024) describe the cleavage architecture inside which that work has to happen, and Jeffrey (2020) documents how political rhetoric shapes whether automation risk is read in redistributive terms at all. Solidarity is constructed. Welfare design's role in that construction is permissive rather than productive, and that distinction, however small it sounds, is the difference between a buffering model and the asymmetric one developed here.</w:t>
       </w:r>
     </w:p>
     <w:p>
@@ -1007,24 +1146,29 @@
           <w:i w:val="0"/>
           <w:sz w:val="24"/>
         </w:rPr>
-        <w:t>The recursive loop should be detectable in panel data as path-dependence in individual attitudes — workers who experience one stigmatising welfare encounter should show elevated exclusionary attitudes years later, controlling for subsequent material conditions. This is the strongest test of the mechanism's one-directional character and the clearest case for a registry-based design.</w:t>
+        <w:t xml:space="preserve">Welfare institutions also do not operate on a blank moral slate. Pelc's (2025) finding that Protestant work ethic predicts compensation resistance independently of material incentives suggests some attitudes exist prior to institutional contact. The welfare state shapes moral frameworks, but it also inherits them. What the asymmetric theory claims is something about the </w:t>
+      </w:r>
+      <w:r>
+        <w:rPr>
+          <w:rFonts w:ascii="Times New Roman" w:hAnsi="Times New Roman"/>
+          <w:b w:val="0"/>
+          <w:i/>
+          <w:sz w:val="24"/>
+        </w:rPr>
+        <w:t>increment</w:t>
+      </w:r>
+      <w:r>
+        <w:rPr>
+          <w:rFonts w:ascii="Times New Roman" w:hAnsi="Times New Roman"/>
+          <w:b w:val="0"/>
+          <w:i w:val="0"/>
+          <w:sz w:val="24"/>
+        </w:rPr>
+        <w:t xml:space="preserve"> welfare design adds to a population's pre-existing moral economy, not a theory of moral formation tout court. In countries where the inherited moral economy already runs along producerist or particularist lines, dignity-preserving welfare has more work to do, and may show smaller apparent effects in cross-section. Distinguishing inherited from produced attitudes empirically requires panel evidence the present cross-section cannot supply. The Danish registry follow-up is the design that can.</w:t>
       </w:r>
     </w:p>
     <w:p>
       <w:pPr>
-        <w:spacing w:before="360" w:after="120" w:line="240" w:lineRule="auto"/>
-      </w:pPr>
-      <w:r>
-        <w:rPr>
-          <w:rFonts w:ascii="Times New Roman" w:hAnsi="Times New Roman"/>
-          <w:b/>
-          <w:sz w:val="24"/>
-        </w:rPr>
-        <w:t>IV. Scope Conditions and Limits</w:t>
-      </w:r>
-    </w:p>
-    <w:p>
-      <w:pPr>
         <w:spacing w:line="480" w:lineRule="auto" w:before="0" w:after="0"/>
       </w:pPr>
       <w:r>
@@ -1034,13 +1178,17 @@
           <w:i w:val="0"/>
           <w:sz w:val="24"/>
         </w:rPr>
-        <w:t>The asymmetric mechanism does not claim that welfare institutions are the only force shaping the political response to economic disruption. It claims that welfare institutions are the institutional condition under which the damage cascade fires, and that no symmetric institutional condition produces a mirror-image solidarity cascade. Both claims have scope conditions worth stating.</w:t>
-      </w:r>
-    </w:p>
-    <w:p>
-      <w:pPr>
-        <w:spacing w:line="480" w:lineRule="auto" w:before="0" w:after="0"/>
-      </w:pPr>
+        <w:t xml:space="preserve">The third limit is the one I am most exposed on theoretically. The loss aversion claim in §III.D borrows machinery from behavioural economics and applies it by analogy to dignity shocks. The supporting empirical work, including Kurer and van Staalduinen (2022) on status discordance and Häusermann (2024) on recognition asymmetry, is consistent with the claim but does not test it directly. A clean test requires within-individual variation in dignity exposure and a counterfactual against which to measure the absence of equivalent uplift, and that test belongs to the registry-based follow-up. What the present paper </w:t>
+      </w:r>
+      <w:r>
+        <w:rPr>
+          <w:rFonts w:ascii="Times New Roman" w:hAnsi="Times New Roman"/>
+          <w:b w:val="0"/>
+          <w:i/>
+          <w:sz w:val="24"/>
+        </w:rPr>
+        <w:t>can</w:t>
+      </w:r>
       <w:r>
         <w:rPr>
           <w:rFonts w:ascii="Times New Roman" w:hAnsi="Times New Roman"/>
@@ -1048,89 +1196,7 @@
           <w:i w:val="0"/>
           <w:sz w:val="24"/>
         </w:rPr>
-        <w:t xml:space="preserve">The first is that the absence of damage is not sufficient for solidarity, but is necessary for it. Universal programmes build social trust (Rothstein 2001) and produce inclusive deservingness narratives (Larsen 2008). Extensive universal provision conveys recognition beyond material security and diminishes zero-sum status perceptions (Häusermann 2024). Nordic welfare states show consistently lower populist support despite globalisation pressures (Norris and Inglehart 2019). These findings are real, but the asymmetric framing reads them as recording the </w:t>
-      </w:r>
-      <w:r>
-        <w:rPr>
-          <w:rFonts w:ascii="Times New Roman" w:hAnsi="Times New Roman"/>
-          <w:b w:val="0"/>
-          <w:i/>
-          <w:sz w:val="24"/>
-        </w:rPr>
-        <w:t>baseline</w:t>
-      </w:r>
-      <w:r>
-        <w:rPr>
-          <w:rFonts w:ascii="Times New Roman" w:hAnsi="Times New Roman"/>
-          <w:b w:val="0"/>
-          <w:i w:val="0"/>
-          <w:sz w:val="24"/>
-        </w:rPr>
-        <w:t xml:space="preserve"> dignity-preserving welfare provides, not the active </w:t>
-      </w:r>
-      <w:r>
-        <w:rPr>
-          <w:rFonts w:ascii="Times New Roman" w:hAnsi="Times New Roman"/>
-          <w:b w:val="0"/>
-          <w:i/>
-          <w:sz w:val="24"/>
-        </w:rPr>
-        <w:t>uplift</w:t>
-      </w:r>
-      <w:r>
-        <w:rPr>
-          <w:rFonts w:ascii="Times New Roman" w:hAnsi="Times New Roman"/>
-          <w:b w:val="0"/>
-          <w:i w:val="0"/>
-          <w:sz w:val="24"/>
-        </w:rPr>
-        <w:t xml:space="preserve"> the buffering model assumes. The political work that converts baseline dignity into active solidarity — coalitional framing, electoral institutions that organise universalist coalitions, narrative entrepreneurs — is out of scope for this paper but not for the broader research programme. Bornschier, Haffert, and Häusermann (2024) describe the cleavage architecture inside which that work has to happen; Jeffrey (2020) documents how political rhetoric shapes whether automation risk is read in redistributive terms at all. Solidarity is constructed; this paper claims welfare design's role in that construction is permissive rather than productive.</w:t>
-      </w:r>
-    </w:p>
-    <w:p>
-      <w:pPr>
-        <w:spacing w:line="480" w:lineRule="auto" w:before="0" w:after="0"/>
-      </w:pPr>
-      <w:r>
-        <w:rPr>
-          <w:rFonts w:ascii="Times New Roman" w:hAnsi="Times New Roman"/>
-          <w:b w:val="0"/>
-          <w:i w:val="0"/>
-          <w:sz w:val="24"/>
-        </w:rPr>
-        <w:t xml:space="preserve">The second scope condition is that the sorting mechanism does not operate on a blank slate. Pelc's (2025) finding that Protestant work ethic predicts compensation resistance independently of material incentives suggests some attitudes exist prior to institutional contact. The welfare state shapes moral frameworks, but it also inherits them. The asymmetric theory is therefore a theory about the </w:t>
-      </w:r>
-      <w:r>
-        <w:rPr>
-          <w:rFonts w:ascii="Times New Roman" w:hAnsi="Times New Roman"/>
-          <w:b w:val="0"/>
-          <w:i/>
-          <w:sz w:val="24"/>
-        </w:rPr>
-        <w:t>increment</w:t>
-      </w:r>
-      <w:r>
-        <w:rPr>
-          <w:rFonts w:ascii="Times New Roman" w:hAnsi="Times New Roman"/>
-          <w:b w:val="0"/>
-          <w:i w:val="0"/>
-          <w:sz w:val="24"/>
-        </w:rPr>
-        <w:t xml:space="preserve"> welfare design adds to a population's pre-existing moral economy, not a theory of moral formation tout court. In countries where the inherited moral economy already runs along producerist or particularist lines, dignity-preserving welfare has more work to do; in countries where universalist moral economies are already entrenched, the same welfare design shows greater apparent effect. Distinguishing inherited from produced attitudes empirically requires panel evidence the present cross-section cannot supply.</w:t>
-      </w:r>
-    </w:p>
-    <w:p>
-      <w:pPr>
-        <w:spacing w:line="480" w:lineRule="auto" w:before="0" w:after="0"/>
-      </w:pPr>
-      <w:r>
-        <w:rPr>
-          <w:rFonts w:ascii="Times New Roman" w:hAnsi="Times New Roman"/>
-          <w:b w:val="0"/>
-          <w:i w:val="0"/>
-          <w:sz w:val="24"/>
-        </w:rPr>
-        <w:t>A third limit is theoretical. The loss aversion claim in §III.D borrows machinery from behavioural economics and applies it by analogy to dignity shocks. The supporting empirical work — Kurer and van Staalduinen (2022) on status discordance, Häusermann (2024) on recognition asymmetry, the broader recognition literature — is consistent with the claim but does not test it directly. A clean test requires within-individual variation in dignity exposure and a counterfactual against which to measure the absence of equivalent uplift. That test is the work of the Danish registry follow-up. The present paper cannot rule out that the asymmetry registered in cross-national data is amplified by measurement choices that under-detect solidarity uplift; what it can do is establish that the asymmetry is large, consistent across specifications, and predicted by the theory it is designed to test.</w:t>
+        <w:t xml:space="preserve"> do is establish that the asymmetry it documents is large, robust across specifications, and predicted by the theory it is designed to test. What it cannot do is rule out that the asymmetry is amplified by measurement choices that under-detect solidarity uplift in single-item attitudinal scales. The cross-sectional finding, while striking, is provisional, and the value of the asymmetric framing is partly that it points to the kind of evidence that would falsify it.</w:t>
       </w:r>
     </w:p>
     <w:p>
@@ -1346,7 +1412,7 @@
           <w:i w:val="0"/>
           <w:sz w:val="24"/>
         </w:rPr>
-        <w:t xml:space="preserve">where β₃ tests whether the conversion of automation exposure into exclusionary attitudes depends on welfare institutional context. I estimate mixed models with country-wave random slopes for RTI — </w:t>
+        <w:t>where β₃ tests whether the conversion of automation exposure into exclusionary attitudes depends on welfare institutional context. I estimate mixed models with country-wave random slopes for RTI (</w:t>
       </w:r>
       <w:r>
         <w:rPr>
@@ -1355,7 +1421,7 @@
           <w:i w:val="0"/>
           <w:sz w:val="20"/>
         </w:rPr>
-        <w:t>(1 + RTI | country-wave)</w:t>
+        <w:t>1 + RTI | country-wave</w:t>
       </w:r>
       <w:r>
         <w:rPr>
@@ -1364,7 +1430,7 @@
           <w:i w:val="0"/>
           <w:sz w:val="24"/>
         </w:rPr>
-        <w:t xml:space="preserve"> — confirmed over random intercepts alone by likelihood ratio test. OLS with country-wave fixed effects and clustered standard errors serves as a robustness check; results are directionally identical. The cross-sectional design cannot establish causality — I test whether the pattern is consistent with the asymmetric mechanism developed in §III and inconsistent with the symmetric "more spending = less backlash" alternative.</w:t>
+        <w:t>), confirmed over random intercepts alone by likelihood ratio test. OLS with country-wave fixed effects and clustered standard errors serves as a robustness check; results are directionally identical. The cross-sectional design cannot establish causality. I test whether the pattern is consistent with the asymmetric mechanism developed in §III and inconsistent with the symmetric "more spending = less backlash" alternative.</w:t>
       </w:r>
     </w:p>
     <w:p>
@@ -1392,39 +1458,131 @@
           <w:i w:val="0"/>
           <w:sz w:val="24"/>
         </w:rPr>
-        <w:t>Figure 2 presents the central descriptive finding. Across all welfare regimes, higher RTI is associated with more anti-immigration attitudes — the relationship is positive and significant everywhere. The slope is steepest in Liberal regimes (β=0.512), followed by Southern (β=0.462), Continental (β=0.443), Nordic (β=0.413), and Eastern (β=0.263). The marginal effects plot (Figure 3) makes the comparison precise: a one-standard-deviation increase in RTI is associated with approximately 0.32 additional scale points of anti-immigration sentiment in Liberal regimes, compared to 0.20 in Nordic regimes. The gap is statistically significant and substantively meaningful.</w:t>
+        <w:t>Figure 2 presents the central descriptive finding. Across all welfare regimes, higher RTI is associated with more anti-immigration attitudes; the relationship is positive and significant everywhere. The slope is steepest in Liberal regimes (β=0.512), followed by Southern (β=0.462), Continental (β=0.443), Nordic (β=0.413), and Eastern (β=0.263). The marginal effects plot (Figure 3) makes the comparison precise: a one-standard-deviation increase in RTI is associated with approximately 0.32 additional scale points of anti-immigration sentiment in Liberal regimes, compared to 0.20 in Nordic regimes. The gap is statistically significant and substantively meaningful.</w:t>
       </w:r>
     </w:p>
     <w:p>
       <w:pPr>
-        <w:spacing w:line="240" w:lineRule="auto" w:before="120" w:after="120"/>
+        <w:spacing w:line="240" w:lineRule="auto" w:before="160" w:after="40"/>
         <w:jc w:val="center"/>
-        <w:shd w:val="clear" w:color="auto" w:fill="E8E8E8"/>
-      </w:pPr>
-      <w:r>
-        <w:rPr>
-          <w:rFonts w:ascii="Times New Roman" w:hAnsi="Times New Roman"/>
-          <w:i/>
-          <w:color w:val="444444"/>
-          <w:sz w:val="22"/>
-        </w:rPr>
-        <w:t>Figure 2 here: RTI vs. anti-immigration by welfare regime. Five-panel binned scatter.</w:t>
+      </w:pPr>
+      <w:r>
+        <w:drawing>
+          <wp:inline xmlns:a="http://schemas.openxmlformats.org/drawingml/2006/main" xmlns:pic="http://schemas.openxmlformats.org/drawingml/2006/picture">
+            <wp:extent cx="5029200" cy="2768885"/>
+            <wp:docPr id="1" name="Picture 1"/>
+            <wp:cNvGraphicFramePr>
+              <a:graphicFrameLocks noChangeAspect="1"/>
+            </wp:cNvGraphicFramePr>
+            <a:graphic>
+              <a:graphicData uri="http://schemas.openxmlformats.org/drawingml/2006/picture">
+                <pic:pic>
+                  <pic:nvPicPr>
+                    <pic:cNvPr id="0" name="fig2_rti_vs_antiimmig_by_regime.png"/>
+                    <pic:cNvPicPr/>
+                  </pic:nvPicPr>
+                  <pic:blipFill>
+                    <a:blip r:embed="rId10"/>
+                    <a:stretch>
+                      <a:fillRect/>
+                    </a:stretch>
+                  </pic:blipFill>
+                  <pic:spPr>
+                    <a:xfrm>
+                      <a:off x="0" y="0"/>
+                      <a:ext cx="5029200" cy="2768885"/>
+                    </a:xfrm>
+                    <a:prstGeom prst="rect"/>
+                  </pic:spPr>
+                </pic:pic>
+              </a:graphicData>
+            </a:graphic>
+          </wp:inline>
+        </w:drawing>
       </w:r>
     </w:p>
     <w:p>
       <w:pPr>
-        <w:spacing w:line="240" w:lineRule="auto" w:before="120" w:after="120"/>
+        <w:spacing w:line="240" w:lineRule="auto" w:before="0" w:after="160"/>
         <w:jc w:val="center"/>
-        <w:shd w:val="clear" w:color="auto" w:fill="E8E8E8"/>
-      </w:pPr>
+      </w:pPr>
+      <w:r>
+        <w:rPr>
+          <w:rFonts w:ascii="Times New Roman" w:hAnsi="Times New Roman"/>
+          <w:b/>
+          <w:sz w:val="20"/>
+        </w:rPr>
+        <w:t xml:space="preserve">Figure 2. </w:t>
+      </w:r>
       <w:r>
         <w:rPr>
           <w:rFonts w:ascii="Times New Roman" w:hAnsi="Times New Roman"/>
           <w:i/>
-          <w:color w:val="444444"/>
-          <w:sz w:val="22"/>
-        </w:rPr>
-        <w:t>Figure 3 here: Marginal effect of 1-SD RTI increase by welfare regime.</w:t>
+          <w:sz w:val="20"/>
+        </w:rPr>
+        <w:t>RTI vs. anti-immigration by welfare regime. Five-panel binned scatter.</w:t>
+      </w:r>
+    </w:p>
+    <w:p>
+      <w:pPr>
+        <w:spacing w:line="240" w:lineRule="auto" w:before="160" w:after="40"/>
+        <w:jc w:val="center"/>
+      </w:pPr>
+      <w:r>
+        <w:drawing>
+          <wp:inline xmlns:a="http://schemas.openxmlformats.org/drawingml/2006/main" xmlns:pic="http://schemas.openxmlformats.org/drawingml/2006/picture">
+            <wp:extent cx="5029200" cy="3109967"/>
+            <wp:docPr id="2" name="Picture 2"/>
+            <wp:cNvGraphicFramePr>
+              <a:graphicFrameLocks noChangeAspect="1"/>
+            </wp:cNvGraphicFramePr>
+            <a:graphic>
+              <a:graphicData uri="http://schemas.openxmlformats.org/drawingml/2006/picture">
+                <pic:pic>
+                  <pic:nvPicPr>
+                    <pic:cNvPr id="0" name="fig3_marginal_effects.png"/>
+                    <pic:cNvPicPr/>
+                  </pic:nvPicPr>
+                  <pic:blipFill>
+                    <a:blip r:embed="rId11"/>
+                    <a:stretch>
+                      <a:fillRect/>
+                    </a:stretch>
+                  </pic:blipFill>
+                  <pic:spPr>
+                    <a:xfrm>
+                      <a:off x="0" y="0"/>
+                      <a:ext cx="5029200" cy="3109967"/>
+                    </a:xfrm>
+                    <a:prstGeom prst="rect"/>
+                  </pic:spPr>
+                </pic:pic>
+              </a:graphicData>
+            </a:graphic>
+          </wp:inline>
+        </w:drawing>
+      </w:r>
+    </w:p>
+    <w:p>
+      <w:pPr>
+        <w:spacing w:line="240" w:lineRule="auto" w:before="0" w:after="160"/>
+        <w:jc w:val="center"/>
+      </w:pPr>
+      <w:r>
+        <w:rPr>
+          <w:rFonts w:ascii="Times New Roman" w:hAnsi="Times New Roman"/>
+          <w:b/>
+          <w:sz w:val="20"/>
+        </w:rPr>
+        <w:t xml:space="preserve">Figure 3. </w:t>
+      </w:r>
+      <w:r>
+        <w:rPr>
+          <w:rFonts w:ascii="Times New Roman" w:hAnsi="Times New Roman"/>
+          <w:i/>
+          <w:sz w:val="20"/>
+        </w:rPr>
+        <w:t>Marginal effect of 1-SD RTI increase by welfare regime.</w:t>
       </w:r>
     </w:p>
     <w:p>
@@ -1452,7 +1610,7 @@
           <w:i w:val="0"/>
           <w:sz w:val="24"/>
         </w:rPr>
-        <w:t>Comparing two welfare measures produces the paper's most important finding. When individual countries' RTI→anti-immigration slopes are plotted against their ALMP spending levels — restricting to the same 15 Western European countries used in the CWED analysis — the correlation is near-zero (r=0.01, p=0.97, N=15). Countries spending more on active labour market policies show no systematically flatter or steeper vulnerability-to-exclusion slopes. Spending effort, holding sample constant, is unrelated to the exclusion pattern.</w:t>
+        <w:t>Comparing two welfare measures produces the paper's most important finding. When individual countries' RTI→anti-immigration slopes are plotted against their ALMP spending levels (restricting to the same 15 Western European countries used in the CWED analysis), the correlation is near-zero (r=0.01, p=0.97, N=15). Countries spending more on active labour market policies show no systematically flatter or steeper vulnerability-to-exclusion slopes. Spending effort, holding sample constant, is unrelated to the exclusion pattern.</w:t>
       </w:r>
     </w:p>
     <w:p>
@@ -1466,23 +1624,69 @@
           <w:i w:val="0"/>
           <w:sz w:val="24"/>
         </w:rPr>
-        <w:t>The picture changes dramatically when welfare is measured by its decommodifying quality. Figure 6 plots the same country-level slopes against CWED total generosity — the composite score capturing how effectively welfare systems enable workers to sustain living standards without employment. The correlation is strongly negative: r=−0.848, p&lt;0.001, N=15 countries. Welfare generosity measured as decommodification is associated with 72 per cent of the cross-country variation in how strongly automation exposure co-varies with exclusionary attitudes. The United Kingdom — lowest in CWED generosity — shows the steepest slope. Norway — highest in generosity — shows the flattest.</w:t>
+        <w:t>The picture changes dramatically when welfare is measured by its decommodifying quality. Figure 6 plots the same country-level slopes against CWED total generosity, the composite score capturing how effectively welfare systems enable workers to sustain living standards without employment. The correlation is strongly negative: r=−0.848, p&lt;0.001, N=15 countries. Welfare generosity measured as decommodification is associated with 72 per cent of the cross-country variation in how strongly automation exposure co-varies with exclusionary attitudes. The United Kingdom, lowest in CWED generosity, shows the steepest slope. Norway, highest in generosity, shows the flattest.</w:t>
       </w:r>
     </w:p>
     <w:p>
       <w:pPr>
-        <w:spacing w:line="240" w:lineRule="auto" w:before="120" w:after="120"/>
+        <w:spacing w:line="240" w:lineRule="auto" w:before="160" w:after="40"/>
         <w:jc w:val="center"/>
-        <w:shd w:val="clear" w:color="auto" w:fill="E8E8E8"/>
-      </w:pPr>
+      </w:pPr>
+      <w:r>
+        <w:drawing>
+          <wp:inline xmlns:a="http://schemas.openxmlformats.org/drawingml/2006/main" xmlns:pic="http://schemas.openxmlformats.org/drawingml/2006/picture">
+            <wp:extent cx="5029200" cy="3698251"/>
+            <wp:docPr id="3" name="Picture 3"/>
+            <wp:cNvGraphicFramePr>
+              <a:graphicFrameLocks noChangeAspect="1"/>
+            </wp:cNvGraphicFramePr>
+            <a:graphic>
+              <a:graphicData uri="http://schemas.openxmlformats.org/drawingml/2006/picture">
+                <pic:pic>
+                  <pic:nvPicPr>
+                    <pic:cNvPr id="0" name="fig6_cwed_country_slopes.png"/>
+                    <pic:cNvPicPr/>
+                  </pic:nvPicPr>
+                  <pic:blipFill>
+                    <a:blip r:embed="rId12"/>
+                    <a:stretch>
+                      <a:fillRect/>
+                    </a:stretch>
+                  </pic:blipFill>
+                  <pic:spPr>
+                    <a:xfrm>
+                      <a:off x="0" y="0"/>
+                      <a:ext cx="5029200" cy="3698251"/>
+                    </a:xfrm>
+                    <a:prstGeom prst="rect"/>
+                  </pic:spPr>
+                </pic:pic>
+              </a:graphicData>
+            </a:graphic>
+          </wp:inline>
+        </w:drawing>
+      </w:r>
+    </w:p>
+    <w:p>
+      <w:pPr>
+        <w:spacing w:line="240" w:lineRule="auto" w:before="0" w:after="160"/>
+        <w:jc w:val="center"/>
+      </w:pPr>
+      <w:r>
+        <w:rPr>
+          <w:rFonts w:ascii="Times New Roman" w:hAnsi="Times New Roman"/>
+          <w:b/>
+          <w:sz w:val="20"/>
+        </w:rPr>
+        <w:t xml:space="preserve">Figure 6. </w:t>
+      </w:r>
       <w:r>
         <w:rPr>
           <w:rFonts w:ascii="Times New Roman" w:hAnsi="Times New Roman"/>
           <w:i/>
-          <w:color w:val="444444"/>
-          <w:sz w:val="22"/>
-        </w:rPr>
-        <w:t>Figure 6 here: CWED generosity vs. country-level RTI→anti-immigration slopes.</w:t>
+          <w:sz w:val="20"/>
+        </w:rPr>
+        <w:t>CWED generosity vs. country-level RTI→anti-immigration slopes.</w:t>
       </w:r>
     </w:p>
     <w:p>
@@ -1983,7 +2187,7 @@
           <w:i w:val="0"/>
           <w:sz w:val="24"/>
         </w:rPr>
-        <w:t xml:space="preserve">: governments can spend heavily on punitive workfare that communicates suspicion. Following Bonoli's (2013) typology — and the more recent treatment in Van Hootegem (2025) — ALMP aggregates across enabling programmes (upskilling, employment counselling) and punitive ones (benefit sanctions, behavioural conditionality), and the political signature of the punitive subset is the opposite of the enabling subset. CWED generosity captures </w:t>
+        <w:t xml:space="preserve">; governments can spend heavily on punitive workfare that communicates suspicion. Following Bonoli's (2013) typology and the more recent treatment in Van Hootegem (2025), ALMP aggregates across enabling programmes (upskilling, employment counselling) and punitive ones (benefit sanctions, behavioural conditionality), and the political signature of the punitive subset runs opposite to the enabling. CWED generosity captures </w:t>
       </w:r>
       <w:r>
         <w:rPr>
@@ -2001,7 +2205,7 @@
           <w:i w:val="0"/>
           <w:sz w:val="24"/>
         </w:rPr>
-        <w:t xml:space="preserve">: the degree to which the welfare state enables citizens to sustain themselves without dependence on market employment. CWED measures what the welfare state </w:t>
+        <w:t xml:space="preserve">; the degree to which the welfare state enables citizens to sustain themselves without dependence on market employment. CWED measures what the welfare state </w:t>
       </w:r>
       <w:r>
         <w:rPr>
@@ -2051,7 +2255,7 @@
           <w:i w:val="0"/>
           <w:sz w:val="24"/>
         </w:rPr>
-        <w:t>Denmark presents an instructive complication. Despite high CWED generosity, Denmark shows a relatively steep RTI→exclusion slope (β=0.50) — higher than Finland, Sweden, or Norway. Danish "flexicurity" combines generous benefits with high labour market flexibility and active job search requirements, creating a system generous in transfers but demanding in activation. Read through the asymmetric mechanism, this is not an anomaly but an additional piece of evidence: what damages the self-concept is conditionality and surveillance, even when transfer levels are high, because conditionality and surveillance are what communicate suspicion. The Denmark observation also previews the within-country test the thesis design will perform — the activation-introducing reforms of 2003, 2006, and 2013 are exactly the kind of within-country shock the asymmetric theory predicts should produce damage signatures even with decommodification levels held relatively constant. The country-level finding is robust to all single-country exclusions: excluding the United Kingdom (lowest CWED) gives r=−0.802; excluding Norway (highest CWED) gives r=−0.794; excluding both simultaneously gives r=−0.717 (p=0.006). The result does not depend on any single case or the two highest-leverage observations jointly.</w:t>
+        <w:t>Denmark presents an instructive complication. Despite high CWED generosity, Denmark shows a relatively steep RTI→exclusion slope (β=0.50), higher than Finland, Sweden, or Norway. Danish "flexicurity" combines generous benefits with high labour market flexibility and active job search requirements, creating a system generous in transfers but demanding in activation. Read through the asymmetric mechanism, this is not an anomaly but an additional piece of evidence; what damages the self-concept is conditionality and surveillance, even when transfer levels are high, because conditionality and surveillance are what communicate suspicion. The Denmark observation previews the within-country test the thesis design will perform. The activation-introducing reforms of 2003, 2006, and 2013 are exactly the kind of within-country shock the asymmetric theory predicts should produce damage signatures even with decommodification levels held relatively constant. The country-level finding is robust to all single-country exclusions: excluding the United Kingdom (lowest CWED) gives r=−0.802; excluding Norway (highest CWED) gives r=−0.794; excluding both simultaneously gives r=−0.717 (p=0.006). The result does not depend on any single case.</w:t>
       </w:r>
     </w:p>
     <w:p>
@@ -2774,7 +2978,7 @@
           <w:i w:val="0"/>
           <w:sz w:val="24"/>
         </w:rPr>
-        <w:t>The redistribution models provide the empirical confirmation of the asymmetric prediction set out in §III. RTI predicts slightly more redistribution support across all regimes (β=0.044, p&lt;0.001), but the cross-regime variation that drives the central exclusion finding does not appear on the solidarity side. The RTI × Liberal coefficient is small, non-significant, and in the wrong direction (β=0.011, p=0.285). Welfare institutional context cleanly attenuates the conversion of vulnerability into exclusion. It does not detectably moderate the conversion of the same vulnerability into redistributive solidarity.</w:t>
+        <w:t>The redistribution models confirm the asymmetric prediction set out in §III, and they do so in the place where the symmetric account most needed them to fail. RTI predicts slightly more redistribution support across all regimes (β=0.044, p&lt;0.001). The cross-regime variation that drives the exclusion finding does not appear on the solidarity side: the RTI × Liberal coefficient is small, non-significant, and in the wrong direction (β=0.011, p=0.285). Welfare institutional context cleanly attenuates the conversion of vulnerability into exclusion. It does not detectably moderate the conversion of the same vulnerability into redistributive solidarity. That is the asymmetry, and it is more than the absence of a finding; it is what the theory predicted in §III.D and what the symmetric buffering account would have to deny.</w:t>
       </w:r>
     </w:p>
     <w:p>
@@ -2788,7 +2992,7 @@
           <w:i w:val="0"/>
           <w:sz w:val="24"/>
         </w:rPr>
-        <w:t>A supplementary test using the ISSP 2006 Role of Government module (N=10,216, 12 countries) finds no interaction between automation exposure and welfare generosity on unemployment spending support (β=+0.010, SE=0.016, p=0.55) — a second null on a different sample, a different outcome variable, and a different time period. This second null is informative under the asymmetric framing. It suggests the protective pathway requires automation exposure to register as a salient class-level threat in public discourse, and 2006 predates that salience by several years (Frey and Osborne's foundational paper appeared in 2013). The damage pathway, by contrast, is detectable in 2012–2018 data without similar contextual scaffolding. The asymmetry is not just cross-sectional; it is detectable across temporal contexts in which the underlying material vulnerabilities are themselves shifting.</w:t>
+        <w:t>The ISSP 2006 Role of Government module (N=10,216, 12 countries) provides a second test on a different sample, a different outcome variable, and a different time period. The result: no interaction between automation exposure and welfare generosity on unemployment spending support (β=+0.010, SE=0.016, p=0.55). A second null. The 2006 data predate the automation discourse of Frey and Osborne (2013) by several years. The protective pathway, on my reading of the asymmetric theory, requires automation exposure to register as a salient class-level threat in public discourse before solidarity can be politically organised around it. The damage pathway carries no such contextual requirement; a stigmatising welfare encounter does its work whether or not the underlying vulnerability has been culturally framed. Two nulls on solidarity, one in 2012–2018 ESS data and one in 2006 ISSP data, and a clear positive on exclusion in the same 2012–2018 ESS data. The asymmetry is detectable across temporal contexts in which the underlying material vulnerabilities are themselves shifting.</w:t>
       </w:r>
     </w:p>
     <w:p>
@@ -2802,7 +3006,7 @@
           <w:i w:val="0"/>
           <w:sz w:val="24"/>
         </w:rPr>
-        <w:t>Treated as a measurement problem, the redistribution null is a limitation: a single-item scale, an insufficiently sensitive panel, missing mediators. Treated as a substantive finding — which the asymmetric theory in §III predicts — it is the paper's strongest confirmation. Welfare design's political effects are real, are mediated by decommodification rather than spending, and run more reliably toward damage than toward repair.</w:t>
+        <w:t>A measurement-problem reading of the redistribution null is available, and I am not in a position to rule it out conclusively. The substantive reading, which the asymmetric theory predicts, is that the null is the paper's strongest confirmation. Welfare design's political effects are real, are mediated by decommodification rather than spending, and run more reliably toward damage than toward repair. The within-country test the thesis design will perform is what would, in principle, distinguish the substantive reading from the measurement one. The cross-sectional test the present paper performs cannot.</w:t>
       </w:r>
     </w:p>
     <w:p>
@@ -2816,7 +3020,7 @@
           <w:i w:val="0"/>
           <w:sz w:val="24"/>
         </w:rPr>
-        <w:t xml:space="preserve">The radical right voting models (Model 6) require honest treatment of a related point. RTI predicts radical right voting in Nordic countries (β=0.220, p&lt;0.001), but the RTI × Liberal interaction is </w:t>
+        <w:t xml:space="preserve">A separate point requires honest treatment. The radical right voting models (Model 6) show RTI predicting radical right voting in Nordic countries (β=0.220, p&lt;0.001) but the RTI × Liberal interaction is </w:t>
       </w:r>
       <w:r>
         <w:rPr>
@@ -2834,7 +3038,7 @@
           <w:i w:val="0"/>
           <w:sz w:val="24"/>
         </w:rPr>
-        <w:t xml:space="preserve"> and significant (β=−0.123, p=0.032) — the opposite direction to the attitudinal finding. The asymmetric framing reads this as a supply-side phenomenon rather than a substantive contradiction. Ireland has no electorally significant radical right party, and the UK's first-past-the-post system suppresses radical right seat conversion despite substantial UKIP vote shares (15–27% in the ESS waves 7–8 period). High-RTI voters in Liberal regimes channelled exclusionary preferences into Brexit support rather than into conventional party votes. The behavioural models should be treated as descriptive of electoral systems' translation of attitudes into votes rather than as tests of the mechanism per se. This paper is about attitudinal sorting; the supply-side question of how sorted attitudes become exclusionary politics is a separate paper.</w:t>
+        <w:t xml:space="preserve"> and significant (β=−0.123, p=0.032), opposite in direction to the attitudinal finding. This is not a substantive contradiction of the mechanism. It is what happens when supply-side institutions intervene between attitudes and votes. Ireland has no electorally significant radical right party. The UK's first-past-the-post system suppresses radical right seat conversion despite substantial UKIP vote shares (15–27% in the ESS waves 7–8 period). High-RTI voters in Liberal regimes channelled exclusionary preferences into Brexit support rather than into conventional party votes. The behavioural models are descriptive of electoral systems' translation of attitudes into votes; they are not tests of the asymmetric mechanism, which is a mechanism about attitudes. The supply-side question of how sorted attitudes become exclusionary politics is the question of a different paper.</w:t>
       </w:r>
     </w:p>
     <w:p>
@@ -2862,7 +3066,7 @@
           <w:i w:val="0"/>
           <w:sz w:val="24"/>
         </w:rPr>
-        <w:t>Several limits matter for how to read these findings. The cross-sectional design cannot establish temporal ordering. Country-level welfare indicators are confounded with other institutional differences: Nordic countries with high CWED generosity also tend to have higher social trust, stronger unions, proportional electoral systems, and lower ethnic heterogeneity, and the macro-controls robustness check (GDP growth, Gini) addresses macroeconomic confounders but not these deeper institutional correlates. The CWED finding, while striking (r=−0.848), rests on 15 country-level observations. The individual-level Model 3 interaction provides a more defensible test, but full identification requires within-country variation in welfare generosity over time — exploiting CWED changes following benefit reforms, a design I intend to pursue with Danish registry data in subsequent work. The asymmetric theory of §III is identified by the clear cross-national signal in the exclusion data and the corresponding null on the solidarity side; what the present design cannot do is rule out that the protective pathway is operating below the resolution of cross-sectional measurement, and a registry-based test of the within-individual recognition mechanism is the natural next step.</w:t>
+        <w:t>Several limits matter for how to read these findings. The cross-sectional design cannot establish temporal ordering. Country-level welfare indicators are confounded with other institutional differences; Nordic countries with high CWED generosity also tend to have higher social trust, stronger unions, proportional electoral systems, and lower ethnic heterogeneity, and the macro-controls robustness check (GDP growth, Gini) addresses macroeconomic confounders but not these deeper institutional correlates. The CWED finding, while striking (r=−0.848), rests on 15 country-level observations. The individual-level Model 3 interaction provides a more defensible test, but full identification requires within-country variation in welfare generosity over time, exploiting CWED changes following benefit reforms; a design I intend to pursue with Danish registry data in subsequent work. The asymmetric theory of §III is identified by the clear cross-national signal in the exclusion data and the corresponding null on the solidarity side. What the present design cannot do is rule out that the protective pathway is operating below the resolution of cross-sectional measurement, and a registry-based test of the within-individual recognition mechanism is the natural next step.</w:t>
       </w:r>
     </w:p>
     <w:p>
@@ -2889,7 +3093,7 @@
           <w:i w:val="0"/>
           <w:sz w:val="24"/>
         </w:rPr>
-        <w:t>The evidence supports the asymmetric account theorised in §III. Welfare design shapes how economic disruption turns into exclusion; it does not equivalently shape how the same disruption turns into solidarity. Disruption processed through welfare institutions that preserve the self-concept does not, in this data, produce detectably stronger redistributive demand than disruption processed through institutions that damage it. Disruption processed through institutions that damage the self-concept does produce detectably stronger exclusionary attitudes. The damage mechanism is empirically legible across all specifications. The mirror-image protective mechanism is not.</w:t>
+        <w:t>The evidence supports the asymmetric account theorised in §III. Welfare design shapes how economic disruption turns into exclusion. It does not equivalently shape how the same disruption turns into solidarity. Disruption processed through welfare institutions that preserve the self-concept does not, in this data, produce detectably stronger redistributive demand than disruption processed through institutions that damage it. Disruption processed through institutions that damage the self-concept does produce detectably stronger exclusionary attitudes. The damage mechanism is empirically legible across every specification this paper presents. The mirror-image protective mechanism is not.</w:t>
       </w:r>
     </w:p>
     <w:p>
@@ -2903,7 +3107,7 @@
           <w:i w:val="0"/>
           <w:sz w:val="24"/>
         </w:rPr>
-        <w:t xml:space="preserve">The contrast between ALMP and CWED results speaks directly to the theoretical argument. The buffering model asks: </w:t>
+        <w:t xml:space="preserve">The ALMP/CWED contrast bears directly on the theoretical argument. The buffering model asks how much the welfare state spends. The asymmetric mechanism asks something different: what the welfare state communicates, and to whom it matters. A country can spend heavily on active labour market policies that are punitive, conditional, and dignity-stripping, and that spending will register as "generous" in conventional measures while communicating suspicion to the people on the receiving end of it. Decommodification captures what spending alone cannot; the degree to which the welfare state enables citizens to maintain their living standards and, crucially, their sense of themselves without dependence on market employment. This is the institutional quality Banerjee and Duflo (2019) identify as the goal of social policy: absorbing shocks without allowing them to affect the self-concept. It is what Kurer and Palier (2019) mean when they argue that routine workers demand "economic </w:t>
       </w:r>
       <w:r>
         <w:rPr>
@@ -2912,7 +3116,7 @@
           <w:i/>
           <w:sz w:val="24"/>
         </w:rPr>
-        <w:t>how much</w:t>
+        <w:t>and</w:t>
       </w:r>
       <w:r>
         <w:rPr>
@@ -2921,7 +3125,35 @@
           <w:i w:val="0"/>
           <w:sz w:val="24"/>
         </w:rPr>
-        <w:t xml:space="preserve"> does the welfare state spend? The asymmetric mechanism asks: </w:t>
+        <w:t xml:space="preserve"> cultural protection" rather than material compensation alone. And it is what Gidron and Hall (2017) document when they find that right-populist voters "care as much, or even more, about recognition as about redistribution." Three literatures, three vocabularies, all pointing at the same underlying institutional dimension. The asymmetric mechanism is what makes them legible as observations of the same thing.</w:t>
+      </w:r>
+    </w:p>
+    <w:p>
+      <w:pPr>
+        <w:spacing w:line="480" w:lineRule="auto" w:before="0" w:after="0"/>
+      </w:pPr>
+      <w:r>
+        <w:rPr>
+          <w:rFonts w:ascii="Times New Roman" w:hAnsi="Times New Roman"/>
+          <w:b w:val="0"/>
+          <w:i w:val="0"/>
+          <w:sz w:val="24"/>
+        </w:rPr>
+        <w:t>These findings change the long-running debate about whether radical right support has "economic" or "cultural" roots. Ciccolini (2025) argues the distinction is flawed because voters give a cultural reading to economic phenomena, and the present paper pushes that argument in an institutional direction. Welfare design is part of what shapes whether economic disruption receives a cultural reading in the first place. Cultural backlash is not a rival explanation to the economic one. It is what economic disruption looks like, cross-nationally, where welfare institutions are less decommodifying. Norris and Inglehart (2019) document a pattern consistent with what is reported here. What the asymmetric mechanism adds is the institutional conditions under which the backlash is more or less likely to fire, and the corresponding observation, which the cultural backlash literature has not had a clean way to make: the cultural reading of economic disruption has no symmetric counterpart on the protective side. There is no "structural-redistributive reading" of economic disruption that dignity-preserving welfare reliably produces in its absence. The asymmetry runs all the way down.</w:t>
+      </w:r>
+    </w:p>
+    <w:p>
+      <w:pPr>
+        <w:spacing w:line="480" w:lineRule="auto" w:before="0" w:after="0"/>
+      </w:pPr>
+      <w:r>
+        <w:rPr>
+          <w:rFonts w:ascii="Times New Roman" w:hAnsi="Times New Roman"/>
+          <w:b w:val="0"/>
+          <w:i w:val="0"/>
+          <w:sz w:val="24"/>
+        </w:rPr>
+        <w:t xml:space="preserve">A note on what this paper does </w:t>
       </w:r>
       <w:r>
         <w:rPr>
@@ -2930,7 +3162,7 @@
           <w:i/>
           <w:sz w:val="24"/>
         </w:rPr>
-        <w:t>what does the welfare state communicate, and to whom does it matter?</w:t>
+        <w:t>not</w:t>
       </w:r>
       <w:r>
         <w:rPr>
@@ -2939,7 +3171,7 @@
           <w:i w:val="0"/>
           <w:sz w:val="24"/>
         </w:rPr>
-        <w:t xml:space="preserve"> A country can spend heavily on active labour market policies that are punitive, conditional, and dignity-stripping — and that spending will register as "generous" while communicating suspicion to recipients. Decommodification captures something different: the degree to which the welfare state enables citizens to maintain their living standards and, crucially, their sense of themselves without dependence on market employment. This is the institutional quality Banerjee and Duflo (2019) identify as the goal of social policy — absorbing shocks without allowing them to affect the self-concept. It is what Kurer and Palier (2019) mean when they argue that routine workers demand "economic and cultural protection" rather than material compensation alone, and what Gidron and Hall (2017) document when they find right-populist voters "care as much, or even more, about recognition as about redistribution."</w:t>
+        <w:t xml:space="preserve"> claim. The argument is about attitudinal sorting, not vote translation. The behavioural results in §V.F (RTI predicts radical right voting in Nordic countries; the RTI × Liberal interaction is negative) are better read as confirmation of that distinction than as a puzzle. Attitudes sort. Supply-side institutions then determine whether attitudes become votes; party systems, electoral rules, and the available radical right options vary substantially across the welfare regimes compared here. The UK and Ireland in the ESS sample lack a conventional radical right channel for exclusionary preferences in the waves studied, and the Brexit referendum provided an unusual offramp for Liberal-regime exclusionary sentiment that conventional party-choice models cannot register. A full account of how sorted attitudes become exclusionary politics requires bringing supply-side variables into the analysis, and ideally extending the dependent variable beyond conventional radical right vote share. That is a separate paper.</w:t>
       </w:r>
     </w:p>
     <w:p>
@@ -2953,7 +3185,25 @@
           <w:i w:val="0"/>
           <w:sz w:val="24"/>
         </w:rPr>
-        <w:t>These findings reframe the long-running debate about whether radical right support has "economic" or "cultural" roots. Ciccolini (2025) argues that the distinction is flawed because voters give a cultural reading to economic phenomena; this paper develops that argument in an institutional direction. Welfare design is part of what shapes whether economic disruption receives a cultural reading in the first place. The cultural backlash is not a rival explanation to the economic one — it is what economic disruption looks like, cross-nationally, where welfare institutions are less decommodifying. Norris and Inglehart's (2019) cultural backlash thesis is consistent with the patterns documented here, but the asymmetric mechanism specifies the institutional conditions under which the backlash is more or less likely to fire. The cultural reading of economic disruption is not autonomous of the institutional environment. It is one of the cascade outcomes the institutional environment helps determine, and it has, in the asymmetric theory, no symmetric counterpart on the protective side: there is no equivalent "structural-redistributive reading" of economic disruption that dignity-preserving welfare reliably produces in its absence.</w:t>
+        <w:t xml:space="preserve">The "dignity dividend," meaning the political returns to welfare design that preserves recipients' sense of themselves, is not captured by standard measures of generosity. It is a property of how welfare is </w:t>
+      </w:r>
+      <w:r>
+        <w:rPr>
+          <w:rFonts w:ascii="Times New Roman" w:hAnsi="Times New Roman"/>
+          <w:b w:val="0"/>
+          <w:i/>
+          <w:sz w:val="24"/>
+        </w:rPr>
+        <w:t>experienced</w:t>
+      </w:r>
+      <w:r>
+        <w:rPr>
+          <w:rFonts w:ascii="Times New Roman" w:hAnsi="Times New Roman"/>
+          <w:b w:val="0"/>
+          <w:i w:val="0"/>
+          <w:sz w:val="24"/>
+        </w:rPr>
+        <w:t>; of whether the encounter leaves a person feeling like a citizen navigating a shared challenge, or like a supplicant demonstrating worthiness. Developing measures of that experiential dimension, and testing whether the asymmetric mechanism survives the within-country variation that cross-sectional designs cannot identify, is the work the Danish registry follow-up is designed to do. The 2003, 2006, and 2013 activation reforms introduced conditionality of exactly the kind the asymmetric theory predicts should produce damage signatures, with underlying decommodification levels held relatively constant. That is as close to a quasi-experimental setting on the dignity margin as the available data permits.</w:t>
       </w:r>
     </w:p>
     <w:p>
@@ -2967,53 +3217,7 @@
           <w:i w:val="0"/>
           <w:sz w:val="24"/>
         </w:rPr>
-        <w:t>This paper is about attitudinal sorting, not vote translation. The behavioural results in §V.F — RTI predicts radical right voting in Nordic countries, the RTI × Liberal interaction is negative — are better read as confirmation of that distinction than as a puzzle to be explained away. Attitudes sort. Supply-side institutions then determine whether attitudes become votes: party systems, electoral rules, and the available radical right options vary substantially across the welfare regimes compared here. The UK and Ireland in the ESS sample lack a conventional radical right channel for exclusionary preferences in the waves studied, and the Brexit referendum provided an unusual offramp for Liberal-regime exclusionary sentiment that conventional party-choice models cannot register. A full account of how sorted attitudes become exclusionary politics requires bringing supply-side variables into the analysis and, ideally, extending the dependent variable beyond conventional radical right vote share. That is a separate paper.</w:t>
-      </w:r>
-    </w:p>
-    <w:p>
-      <w:pPr>
-        <w:spacing w:line="480" w:lineRule="auto" w:before="0" w:after="0"/>
-      </w:pPr>
-      <w:r>
-        <w:rPr>
-          <w:rFonts w:ascii="Times New Roman" w:hAnsi="Times New Roman"/>
-          <w:b w:val="0"/>
-          <w:i w:val="0"/>
-          <w:sz w:val="24"/>
-        </w:rPr>
-        <w:t xml:space="preserve">The "dignity dividend" — the political returns to welfare design that preserves recipients' sense of themselves — is not captured by standard measures of generosity. It is a property of how welfare is </w:t>
-      </w:r>
-      <w:r>
-        <w:rPr>
-          <w:rFonts w:ascii="Times New Roman" w:hAnsi="Times New Roman"/>
-          <w:b w:val="0"/>
-          <w:i/>
-          <w:sz w:val="24"/>
-        </w:rPr>
-        <w:t>experienced</w:t>
-      </w:r>
-      <w:r>
-        <w:rPr>
-          <w:rFonts w:ascii="Times New Roman" w:hAnsi="Times New Roman"/>
-          <w:b w:val="0"/>
-          <w:i w:val="0"/>
-          <w:sz w:val="24"/>
-        </w:rPr>
-        <w:t>: whether the encounter leaves individuals feeling like citizens navigating a shared challenge, or like supplicants demonstrating worthiness. Developing measures of this experiential dimension, and testing whether the asymmetric mechanism survives the within-country variation that cross-sectional designs cannot identify, is the task I intend to pursue using Danish registry data in subsequent work. The 2003, 2006, and 2013 Danish activation reforms introduced conditionality of exactly the kind the asymmetric theory predicts should produce damage signatures, with underlying decommodification levels held relatively constant — a quasi-experimental setting close to the ideal for the within-country test the cross-sectional design here cannot perform.</w:t>
-      </w:r>
-    </w:p>
-    <w:p>
-      <w:pPr>
-        <w:spacing w:line="480" w:lineRule="auto" w:before="0" w:after="0"/>
-      </w:pPr>
-      <w:r>
-        <w:rPr>
-          <w:rFonts w:ascii="Times New Roman" w:hAnsi="Times New Roman"/>
-          <w:b w:val="0"/>
-          <w:i w:val="0"/>
-          <w:sz w:val="24"/>
-        </w:rPr>
-        <w:t>The welfare state is more than a response to the politics of economic disruption. The cross-national patterns documented here are consistent with welfare design shaping the political direction of that disruption — a claim the present evidence supports associatively, and that designs exploiting policy changes over time will need to establish causally. What the evidence establishes is narrower and firmer: decommodification, not spending, is the dimension of welfare design along which the political consequences of economic disruption are visible, and the consequences themselves are asymmetric — clearly toward damage, much less reliably toward repair. The buffering model's instinct, that welfare design matters politically, is correct. Its specific account of how welfare design matters — symmetric, quantity-based, intensity-modulating — is wrong in a way the data and the theory together now make legible.</w:t>
+        <w:t>The welfare state is, finally, more than a response to the politics of economic disruption. The cross-national patterns documented here are consistent with welfare design shaping the political direction of that disruption, a claim the present evidence supports associatively and that designs exploiting policy changes over time will need to establish causally. What the evidence does establish is narrower and firmer. Decommodification, not spending, is the dimension of welfare design along which the political consequences of economic disruption are visible. The consequences themselves are asymmetric; clearly toward damage, much less reliably toward repair. The buffering model's instinct, that welfare design matters politically, is correct. Its specific account of how welfare design matters (symmetric, quantity-based, intensity-modulating) is wrong in a way the data and the theory now make legible together. Dignity is a baseline good. The buffering model has been treating it as a quantity.</w:t>
       </w:r>
     </w:p>
     <w:p>

</xml_diff>